<commit_message>
Hazel's recorded script and 72 voice clips; Whisper check of every clip
Co-Authored-By: Claude Opus 5.5 <noreply@anthropic.com>
Claude-Session: https://claude.ai/code/session_01TeVA9WJDfvrL1N6Qe3Kpqx
</commit_message>
<xml_diff>
--- a/docs/voice/Charm_Combo_Voice_Script.docx
+++ b/docs/voice/Charm_Combo_Voice_Script.docx
@@ -541,7 +541,7 @@
                 <w:sz w:val="20"/>
                 <w:szCs w:val="20"/>
               </w:rPr>
-              <w:t xml:space="preserve">73</w:t>
+              <w:t xml:space="preserve">66</w:t>
             </w:r>
           </w:p>
         </w:tc>
@@ -609,7 +609,7 @@
                 <w:sz w:val="20"/>
                 <w:szCs w:val="20"/>
               </w:rPr>
-              <w:t xml:space="preserve">295</w:t>
+              <w:t xml:space="preserve">288</w:t>
             </w:r>
           </w:p>
         </w:tc>
@@ -6849,7 +6849,7 @@
           <w:sz w:val="25"/>
           <w:szCs w:val="25"/>
         </w:rPr>
-        <w:t xml:space="preserve">That's off the comb's box. So it went in right here.</w:t>
+        <w:t xml:space="preserve">That's off the comb's box. So it went right in there.</w:t>
       </w:r>
     </w:p>
     <w:p>
@@ -9021,7 +9021,7 @@
           <w:sz w:val="25"/>
           <w:szCs w:val="25"/>
         </w:rPr>
-        <w:t xml:space="preserve">There. Now you can't go anywhere. That's a mermaid thing. It's very old. I just made it up.</w:t>
+        <w:t xml:space="preserve">There. Now you can't go anywhere. It's a mermaid thing. It's very old. I just made it up.</w:t>
       </w:r>
     </w:p>
     <w:p>
@@ -16261,22 +16261,22 @@
           <w:rFonts w:ascii="Arial" w:cs="Arial" w:eastAsia="Arial" w:hAnsi="Arial"/>
           <w:b/>
           <w:bCs/>
-          <w:color w:val="B23A3A"/>
-          <w:sz w:val="17"/>
-          <w:szCs w:val="17"/>
-        </w:rPr>
-        <w:t xml:space="preserve">   angry</w:t>
-      </w:r>
-      <w:r>
-        <w:rPr>
-          <w:rFonts w:ascii="Arial" w:cs="Arial" w:eastAsia="Arial" w:hAnsi="Arial"/>
-          <w:i/>
-          <w:iCs/>
-          <w:color w:val="2E2433"/>
-          <w:sz w:val="18"/>
-          <w:szCs w:val="18"/>
-        </w:rPr>
-        <w:t xml:space="preserve">   You're about to cut her tree. Calm, but threatening.</w:t>
+          <w:color w:val="6B6B6B"/>
+          <w:sz w:val="17"/>
+          <w:szCs w:val="17"/>
+        </w:rPr>
+        <w:t xml:space="preserve">   neutral</w:t>
+      </w:r>
+      <w:r>
+        <w:rPr>
+          <w:rFonts w:ascii="Arial" w:cs="Arial" w:eastAsia="Arial" w:hAnsi="Arial"/>
+          <w:i/>
+          <w:iCs/>
+          <w:color w:val="2E2433"/>
+          <w:sz w:val="18"/>
+          <w:szCs w:val="18"/>
+        </w:rPr>
+        <w:t xml:space="preserve">   Calm.</w:t>
       </w:r>
     </w:p>
     <w:p>
@@ -16310,7 +16310,7 @@
           <w:sz w:val="25"/>
           <w:szCs w:val="25"/>
         </w:rPr>
-        <w:t xml:space="preserve">You were aiming just below my heart. That takes forty years or so to heal.</w:t>
+        <w:t xml:space="preserve">You'd have struck just below my heart. It would take... forty years or so to heal.</w:t>
       </w:r>
     </w:p>
     <w:p>
@@ -16333,38 +16333,38 @@
           <w:rFonts w:ascii="Arial" w:cs="Arial" w:eastAsia="Arial" w:hAnsi="Arial"/>
           <w:b/>
           <w:bCs/>
-          <w:color w:val="3C6E9E"/>
-          <w:sz w:val="17"/>
-          <w:szCs w:val="17"/>
-        </w:rPr>
-        <w:t xml:space="preserve">   sad</w:t>
-      </w:r>
-      <w:r>
-        <w:rPr>
-          <w:rFonts w:ascii="Arial" w:cs="Arial" w:eastAsia="Arial" w:hAnsi="Arial"/>
-          <w:i/>
-          <w:iCs/>
-          <w:color w:val="2E2433"/>
-          <w:sz w:val="18"/>
-          <w:szCs w:val="18"/>
-        </w:rPr>
-        <w:t xml:space="preserve">   Calm, not angry, a little sad.</w:t>
-      </w:r>
-    </w:p>
-    <w:p>
-      <w:pPr>
-        <w:keepNext/>
-        <w:spacing w:after="30" w:before="40"/>
-        <w:ind w:left="360"/>
-      </w:pPr>
-      <w:r>
-        <w:rPr>
-          <w:rFonts w:ascii="Arial" w:cs="Arial" w:eastAsia="Arial" w:hAnsi="Arial"/>
-          <w:color w:val="2E2433"/>
-          <w:sz w:val="25"/>
-          <w:szCs w:val="25"/>
-        </w:rPr>
-        <w:t xml:space="preserve">Let me guess. Aldous paid you half up front.</w:t>
+          <w:color w:val="6B6B6B"/>
+          <w:sz w:val="17"/>
+          <w:szCs w:val="17"/>
+        </w:rPr>
+        <w:t xml:space="preserve">   neutral</w:t>
+      </w:r>
+      <w:r>
+        <w:rPr>
+          <w:rFonts w:ascii="Arial" w:cs="Arial" w:eastAsia="Arial" w:hAnsi="Arial"/>
+          <w:i/>
+          <w:iCs/>
+          <w:color w:val="2E2433"/>
+          <w:sz w:val="18"/>
+          <w:szCs w:val="18"/>
+        </w:rPr>
+        <w:t xml:space="preserve">   Serious.</w:t>
+      </w:r>
+    </w:p>
+    <w:p>
+      <w:pPr>
+        <w:keepNext/>
+        <w:spacing w:after="30" w:before="40"/>
+        <w:ind w:left="360"/>
+      </w:pPr>
+      <w:r>
+        <w:rPr>
+          <w:rFonts w:ascii="Arial" w:cs="Arial" w:eastAsia="Arial" w:hAnsi="Arial"/>
+          <w:color w:val="2E2433"/>
+          <w:sz w:val="25"/>
+          <w:szCs w:val="25"/>
+        </w:rPr>
+        <w:t xml:space="preserve">The miller sent you? He sends someone every spring.</w:t>
       </w:r>
     </w:p>
     <w:p>
@@ -16387,22 +16387,22 @@
           <w:rFonts w:ascii="Arial" w:cs="Arial" w:eastAsia="Arial" w:hAnsi="Arial"/>
           <w:b/>
           <w:bCs/>
-          <w:color w:val="6B6B6B"/>
-          <w:sz w:val="17"/>
-          <w:szCs w:val="17"/>
-        </w:rPr>
-        <w:t xml:space="preserve">   neutral</w:t>
-      </w:r>
-      <w:r>
-        <w:rPr>
-          <w:rFonts w:ascii="Arial" w:cs="Arial" w:eastAsia="Arial" w:hAnsi="Arial"/>
-          <w:i/>
-          <w:iCs/>
-          <w:color w:val="2E2433"/>
-          <w:sz w:val="18"/>
-          <w:szCs w:val="18"/>
-        </w:rPr>
-        <w:t xml:space="preserve">   Dry, tired more than cross. Aldous the miller sends someone every spring.</w:t>
+          <w:color w:val="B23A3A"/>
+          <w:sz w:val="17"/>
+          <w:szCs w:val="17"/>
+        </w:rPr>
+        <w:t xml:space="preserve">   angry</w:t>
+      </w:r>
+      <w:r>
+        <w:rPr>
+          <w:rFonts w:ascii="Arial" w:cs="Arial" w:eastAsia="Arial" w:hAnsi="Arial"/>
+          <w:i/>
+          <w:iCs/>
+          <w:color w:val="2E2433"/>
+          <w:sz w:val="18"/>
+          <w:szCs w:val="18"/>
+        </w:rPr>
+        <w:t xml:space="preserve">   Annoyed.</w:t>
       </w:r>
     </w:p>
     <w:p>
@@ -16436,7 +16436,7 @@
           <w:sz w:val="25"/>
           <w:szCs w:val="25"/>
         </w:rPr>
-        <w:t xml:space="preserve">Oh. You're putting it down. Most of them argue first.</w:t>
+        <w:t xml:space="preserve">Oh, you're putting it down. Most argue first.</w:t>
       </w:r>
     </w:p>
     <w:p>
@@ -16474,23 +16474,23 @@
           <w:sz w:val="18"/>
           <w:szCs w:val="18"/>
         </w:rPr>
-        <w:t xml:space="preserve">   Mildly surprised. A little disarmed.</w:t>
-      </w:r>
-    </w:p>
-    <w:p>
-      <w:pPr>
-        <w:keepNext/>
-        <w:spacing w:after="30" w:before="40"/>
-        <w:ind w:left="360"/>
-      </w:pPr>
-      <w:r>
-        <w:rPr>
-          <w:rFonts w:ascii="Arial" w:cs="Arial" w:eastAsia="Arial" w:hAnsi="Arial"/>
-          <w:color w:val="2E2433"/>
-          <w:sz w:val="25"/>
-          <w:szCs w:val="25"/>
-        </w:rPr>
-        <w:t xml:space="preserve">The last one argued with the axe still in his hands, so I dropped a beehive on him. I wouldn't do that to you. Your face is too nice to waste on bees.</w:t>
+        <w:t xml:space="preserve">   Surprised.</w:t>
+      </w:r>
+    </w:p>
+    <w:p>
+      <w:pPr>
+        <w:keepNext/>
+        <w:spacing w:after="30" w:before="40"/>
+        <w:ind w:left="360"/>
+      </w:pPr>
+      <w:r>
+        <w:rPr>
+          <w:rFonts w:ascii="Arial" w:cs="Arial" w:eastAsia="Arial" w:hAnsi="Arial"/>
+          <w:color w:val="2E2433"/>
+          <w:sz w:val="25"/>
+          <w:szCs w:val="25"/>
+        </w:rPr>
+        <w:t xml:space="preserve">I had to drop a branch on the last guy, but don't worry, your face is too nice.</w:t>
       </w:r>
     </w:p>
     <w:p>
@@ -16513,22 +16513,22 @@
           <w:rFonts w:ascii="Arial" w:cs="Arial" w:eastAsia="Arial" w:hAnsi="Arial"/>
           <w:b/>
           <w:bCs/>
-          <w:color w:val="6B6B6B"/>
-          <w:sz w:val="17"/>
-          <w:szCs w:val="17"/>
-        </w:rPr>
-        <w:t xml:space="preserve">   neutral</w:t>
-      </w:r>
-      <w:r>
-        <w:rPr>
-          <w:rFonts w:ascii="Arial" w:cs="Arial" w:eastAsia="Arial" w:hAnsi="Arial"/>
-          <w:i/>
-          <w:iCs/>
-          <w:color w:val="2E2433"/>
-          <w:sz w:val="18"/>
-          <w:szCs w:val="18"/>
-        </w:rPr>
-        <w:t xml:space="preserve">   Bone-dry, perfectly pleasant. The compliment comes out in the same flat tone.</w:t>
+          <w:color w:val="7A3FB0"/>
+          <w:sz w:val="17"/>
+          <w:szCs w:val="17"/>
+        </w:rPr>
+        <w:t xml:space="preserve">   teasing</w:t>
+      </w:r>
+      <w:r>
+        <w:rPr>
+          <w:rFonts w:ascii="Arial" w:cs="Arial" w:eastAsia="Arial" w:hAnsi="Arial"/>
+          <w:i/>
+          <w:iCs/>
+          <w:color w:val="2E2433"/>
+          <w:sz w:val="18"/>
+          <w:szCs w:val="18"/>
+        </w:rPr>
+        <w:t xml:space="preserve">   Flirting.</w:t>
       </w:r>
     </w:p>
     <w:p>
@@ -16562,7 +16562,7 @@
           <w:sz w:val="25"/>
           <w:szCs w:val="25"/>
         </w:rPr>
-        <w:t xml:space="preserve">I know about the wall. My roots go where the water is, and they've never once asked my opinion.</w:t>
+        <w:t xml:space="preserve">I know about the wall. My roots go where the water is. I can't control it.</w:t>
       </w:r>
     </w:p>
     <w:p>
@@ -16600,23 +16600,23 @@
           <w:sz w:val="18"/>
           <w:szCs w:val="18"/>
         </w:rPr>
-        <w:t xml:space="preserve">   Tired. She's had this argument with herself for years.</w:t>
-      </w:r>
-    </w:p>
-    <w:p>
-      <w:pPr>
-        <w:keepNext/>
-        <w:spacing w:after="30" w:before="40"/>
-        <w:ind w:left="360"/>
-      </w:pPr>
-      <w:r>
-        <w:rPr>
-          <w:rFonts w:ascii="Arial" w:cs="Arial" w:eastAsia="Arial" w:hAnsi="Arial"/>
-          <w:color w:val="2E2433"/>
-          <w:sz w:val="25"/>
-          <w:szCs w:val="25"/>
-        </w:rPr>
-        <w:t xml:space="preserve">If someone dug him a new channel further out, my roots would follow the water. It would take a season. Nobody's ever offered. It's a lot of digging.</w:t>
+        <w:t xml:space="preserve">   Tired.</w:t>
+      </w:r>
+    </w:p>
+    <w:p>
+      <w:pPr>
+        <w:keepNext/>
+        <w:spacing w:after="30" w:before="40"/>
+        <w:ind w:left="360"/>
+      </w:pPr>
+      <w:r>
+        <w:rPr>
+          <w:rFonts w:ascii="Arial" w:cs="Arial" w:eastAsia="Arial" w:hAnsi="Arial"/>
+          <w:color w:val="2E2433"/>
+          <w:sz w:val="25"/>
+          <w:szCs w:val="25"/>
+        </w:rPr>
+        <w:t xml:space="preserve">If someone dug him a new channel, further out, I could follow it. It would take a season.</w:t>
       </w:r>
     </w:p>
     <w:p>
@@ -16639,22 +16639,22 @@
           <w:rFonts w:ascii="Arial" w:cs="Arial" w:eastAsia="Arial" w:hAnsi="Arial"/>
           <w:b/>
           <w:bCs/>
-          <w:color w:val="6B6B6B"/>
-          <w:sz w:val="17"/>
-          <w:szCs w:val="17"/>
-        </w:rPr>
-        <w:t xml:space="preserve">   neutral</w:t>
-      </w:r>
-      <w:r>
-        <w:rPr>
-          <w:rFonts w:ascii="Arial" w:cs="Arial" w:eastAsia="Arial" w:hAnsi="Arial"/>
-          <w:i/>
-          <w:iCs/>
-          <w:color w:val="2E2433"/>
-          <w:sz w:val="18"/>
-          <w:szCs w:val="18"/>
-        </w:rPr>
-        <w:t xml:space="preserve">   Plain. A small hope she won't admit to; the last sentence is a hint.</w:t>
+          <w:color w:val="2F7D4A"/>
+          <w:sz w:val="17"/>
+          <w:szCs w:val="17"/>
+        </w:rPr>
+        <w:t xml:space="preserve">   happy</w:t>
+      </w:r>
+      <w:r>
+        <w:rPr>
+          <w:rFonts w:ascii="Arial" w:cs="Arial" w:eastAsia="Arial" w:hAnsi="Arial"/>
+          <w:i/>
+          <w:iCs/>
+          <w:color w:val="2E2433"/>
+          <w:sz w:val="18"/>
+          <w:szCs w:val="18"/>
+        </w:rPr>
+        <w:t xml:space="preserve">   Hopeful.</w:t>
       </w:r>
     </w:p>
     <w:p>
@@ -16709,7 +16709,7 @@
           <w:sz w:val="25"/>
           <w:szCs w:val="25"/>
         </w:rPr>
-        <w:t xml:space="preserve">By hand? You'll be at it till midsummer. I suppose I'll have to put up with you all spring.</w:t>
+        <w:t xml:space="preserve">All spring, by hand? I guess I'll have to get used to you.</w:t>
       </w:r>
     </w:p>
     <w:p>
@@ -16732,22 +16732,22 @@
           <w:rFonts w:ascii="Arial" w:cs="Arial" w:eastAsia="Arial" w:hAnsi="Arial"/>
           <w:b/>
           <w:bCs/>
-          <w:color w:val="B7791F"/>
-          <w:sz w:val="17"/>
-          <w:szCs w:val="17"/>
-        </w:rPr>
-        <w:t xml:space="preserve">   surprised</w:t>
-      </w:r>
-      <w:r>
-        <w:rPr>
-          <w:rFonts w:ascii="Arial" w:cs="Arial" w:eastAsia="Arial" w:hAnsi="Arial"/>
-          <w:i/>
-          <w:iCs/>
-          <w:color w:val="2E2433"/>
-          <w:sz w:val="18"/>
-          <w:szCs w:val="18"/>
-        </w:rPr>
-        <w:t xml:space="preserve">   Slow disbelief, touched. The second sentence pretends to be a complaint.</w:t>
+          <w:color w:val="2F7D4A"/>
+          <w:sz w:val="17"/>
+          <w:szCs w:val="17"/>
+        </w:rPr>
+        <w:t xml:space="preserve">   happy</w:t>
+      </w:r>
+      <w:r>
+        <w:rPr>
+          <w:rFonts w:ascii="Arial" w:cs="Arial" w:eastAsia="Arial" w:hAnsi="Arial"/>
+          <w:i/>
+          <w:iCs/>
+          <w:color w:val="2E2433"/>
+          <w:sz w:val="18"/>
+          <w:szCs w:val="18"/>
+        </w:rPr>
+        <w:t xml:space="preserve">   Happy.</w:t>
       </w:r>
     </w:p>
     <w:p>
@@ -16781,7 +16781,7 @@
           <w:sz w:val="25"/>
           <w:szCs w:val="25"/>
         </w:rPr>
-        <w:t xml:space="preserve">Start by the alder, the ground's soft there. And roll your sleeves up. For the digging.</w:t>
+        <w:t xml:space="preserve">Now start at the alder and sleeves up.</w:t>
       </w:r>
     </w:p>
     <w:p>
@@ -16804,22 +16804,22 @@
           <w:rFonts w:ascii="Arial" w:cs="Arial" w:eastAsia="Arial" w:hAnsi="Arial"/>
           <w:b/>
           <w:bCs/>
-          <w:color w:val="2F7D4A"/>
-          <w:sz w:val="17"/>
-          <w:szCs w:val="17"/>
-        </w:rPr>
-        <w:t xml:space="preserve">   happy</w:t>
-      </w:r>
-      <w:r>
-        <w:rPr>
-          <w:rFonts w:ascii="Arial" w:cs="Arial" w:eastAsia="Arial" w:hAnsi="Arial"/>
-          <w:i/>
-          <w:iCs/>
-          <w:color w:val="2E2433"/>
-          <w:sz w:val="18"/>
-          <w:szCs w:val="18"/>
-        </w:rPr>
-        <w:t xml:space="preserve">   Practical, then a short pause before the excuse at the end.</w:t>
+          <w:color w:val="7A3FB0"/>
+          <w:sz w:val="17"/>
+          <w:szCs w:val="17"/>
+        </w:rPr>
+        <w:t xml:space="preserve">   teasing</w:t>
+      </w:r>
+      <w:r>
+        <w:rPr>
+          <w:rFonts w:ascii="Arial" w:cs="Arial" w:eastAsia="Arial" w:hAnsi="Arial"/>
+          <w:i/>
+          <w:iCs/>
+          <w:color w:val="2E2433"/>
+          <w:sz w:val="18"/>
+          <w:szCs w:val="18"/>
+        </w:rPr>
+        <w:t xml:space="preserve">   Flirting.</w:t>
       </w:r>
     </w:p>
     <w:p>
@@ -16874,7 +16874,7 @@
           <w:sz w:val="25"/>
           <w:szCs w:val="25"/>
         </w:rPr>
-        <w:t xml:space="preserve">Keep it. Buy yourself a better axe and never use it.</w:t>
+        <w:t xml:space="preserve">Greedy. Oh, so you'll make him pay you to help me? I like that.</w:t>
       </w:r>
     </w:p>
     <w:p>
@@ -16897,6 +16897,60 @@
           <w:rFonts w:ascii="Arial" w:cs="Arial" w:eastAsia="Arial" w:hAnsi="Arial"/>
           <w:b/>
           <w:bCs/>
+          <w:color w:val="2F7D4A"/>
+          <w:sz w:val="17"/>
+          <w:szCs w:val="17"/>
+        </w:rPr>
+        <w:t xml:space="preserve">   happy</w:t>
+      </w:r>
+      <w:r>
+        <w:rPr>
+          <w:rFonts w:ascii="Arial" w:cs="Arial" w:eastAsia="Arial" w:hAnsi="Arial"/>
+          <w:i/>
+          <w:iCs/>
+          <w:color w:val="2E2433"/>
+          <w:sz w:val="18"/>
+          <w:szCs w:val="18"/>
+        </w:rPr>
+        <w:t xml:space="preserve">   Happy.</w:t>
+      </w:r>
+    </w:p>
+    <w:p>
+      <w:pPr>
+        <w:keepNext/>
+        <w:spacing w:after="30" w:before="40"/>
+        <w:ind w:left="360"/>
+      </w:pPr>
+      <w:r>
+        <w:rPr>
+          <w:rFonts w:ascii="Arial" w:cs="Arial" w:eastAsia="Arial" w:hAnsi="Arial"/>
+          <w:color w:val="2E2433"/>
+          <w:sz w:val="25"/>
+          <w:szCs w:val="25"/>
+        </w:rPr>
+        <w:t xml:space="preserve">Start at the alder. I'll enjoy the view.</w:t>
+      </w:r>
+    </w:p>
+    <w:p>
+      <w:pPr>
+        <w:keepLines/>
+        <w:spacing w:after="140"/>
+        <w:ind w:left="360"/>
+      </w:pPr>
+      <w:r>
+        <w:rPr>
+          <w:rFonts w:ascii="Courier New" w:cs="Courier New" w:eastAsia="Courier New" w:hAnsi="Courier New"/>
+          <w:color w:val="7A6B78"/>
+          <w:sz w:val="16"/>
+          <w:szCs w:val="16"/>
+        </w:rPr>
+        <w:t xml:space="preserve">hazel_intro_r2_02</w:t>
+      </w:r>
+      <w:r>
+        <w:rPr>
+          <w:rFonts w:ascii="Arial" w:cs="Arial" w:eastAsia="Arial" w:hAnsi="Arial"/>
+          <w:b/>
+          <w:bCs/>
           <w:color w:val="6B6B6B"/>
           <w:sz w:val="17"/>
           <w:szCs w:val="17"/>
@@ -16912,61 +16966,7 @@
           <w:sz w:val="18"/>
           <w:szCs w:val="18"/>
         </w:rPr>
-        <w:t xml:space="preserve">   Dry, amused.</w:t>
-      </w:r>
-    </w:p>
-    <w:p>
-      <w:pPr>
-        <w:keepNext/>
-        <w:spacing w:after="30" w:before="40"/>
-        <w:ind w:left="360"/>
-      </w:pPr>
-      <w:r>
-        <w:rPr>
-          <w:rFonts w:ascii="Arial" w:cs="Arial" w:eastAsia="Arial" w:hAnsi="Arial"/>
-          <w:color w:val="2E2433"/>
-          <w:sz w:val="25"/>
-          <w:szCs w:val="25"/>
-        </w:rPr>
-        <w:t xml:space="preserve">Start by the alder. If you hit a root, say sorry. It's me, and I'll be listening.</w:t>
-      </w:r>
-    </w:p>
-    <w:p>
-      <w:pPr>
-        <w:keepLines/>
-        <w:spacing w:after="140"/>
-        <w:ind w:left="360"/>
-      </w:pPr>
-      <w:r>
-        <w:rPr>
-          <w:rFonts w:ascii="Courier New" w:cs="Courier New" w:eastAsia="Courier New" w:hAnsi="Courier New"/>
-          <w:color w:val="7A6B78"/>
-          <w:sz w:val="16"/>
-          <w:szCs w:val="16"/>
-        </w:rPr>
-        <w:t xml:space="preserve">hazel_intro_r2_02</w:t>
-      </w:r>
-      <w:r>
-        <w:rPr>
-          <w:rFonts w:ascii="Arial" w:cs="Arial" w:eastAsia="Arial" w:hAnsi="Arial"/>
-          <w:b/>
-          <w:bCs/>
-          <w:color w:val="6B6B6B"/>
-          <w:sz w:val="17"/>
-          <w:szCs w:val="17"/>
-        </w:rPr>
-        <w:t xml:space="preserve">   neutral</w:t>
-      </w:r>
-      <w:r>
-        <w:rPr>
-          <w:rFonts w:ascii="Arial" w:cs="Arial" w:eastAsia="Arial" w:hAnsi="Arial"/>
-          <w:i/>
-          <w:iCs/>
-          <w:color w:val="2E2433"/>
-          <w:sz w:val="18"/>
-          <w:szCs w:val="18"/>
-        </w:rPr>
-        <w:t xml:space="preserve">   Deadpan. She means the apology.</w:t>
+        <w:t xml:space="preserve">   Teasing.</w:t>
       </w:r>
     </w:p>
     <w:p>
@@ -17021,7 +17021,7 @@
           <w:sz w:val="25"/>
           <w:szCs w:val="25"/>
         </w:rPr>
-        <w:t xml:space="preserve">That's a lovely trench, if you're planning to bury somebody. For a millrace it's a start.</w:t>
+        <w:t xml:space="preserve">That's a good trench, for a grave.</w:t>
       </w:r>
     </w:p>
     <w:p>
@@ -17059,7 +17059,7 @@
           <w:sz w:val="18"/>
           <w:szCs w:val="18"/>
         </w:rPr>
-        <w:t xml:space="preserve">   Teasing, unhurried.</w:t>
+        <w:t xml:space="preserve">   Teasing.</w:t>
       </w:r>
     </w:p>
     <w:p>
@@ -17093,7 +17093,7 @@
           <w:sz w:val="25"/>
           <w:szCs w:val="25"/>
         </w:rPr>
-        <w:t xml:space="preserve">Oh. You're warm. Nobody's put a hand on me in years, unless they were measuring where to cut.</w:t>
+        <w:t xml:space="preserve">Oh, you're warm... No one's touched me without an axe in years.</w:t>
       </w:r>
     </w:p>
     <w:p>
@@ -17131,7 +17131,7 @@
           <w:sz w:val="18"/>
           <w:szCs w:val="18"/>
         </w:rPr>
-        <w:t xml:space="preserve">   Surprised, caught off guard.</w:t>
+        <w:t xml:space="preserve">   Surprised.</w:t>
       </w:r>
     </w:p>
     <w:p>
@@ -17165,7 +17165,7 @@
           <w:sz w:val="25"/>
           <w:szCs w:val="25"/>
         </w:rPr>
-        <w:t xml:space="preserve">Leave it. Bit lower, if you like. The bark's softer.</w:t>
+        <w:t xml:space="preserve">Leave it there a minute. It's been a long time.</w:t>
       </w:r>
     </w:p>
     <w:p>
@@ -17203,7 +17203,7 @@
           <w:sz w:val="18"/>
           <w:szCs w:val="18"/>
         </w:rPr>
-        <w:t xml:space="preserve">   Quiet and low; a little embarrassed she said it.</w:t>
+        <w:t xml:space="preserve">   Shy.</w:t>
       </w:r>
     </w:p>
     <w:p>
@@ -17296,23 +17296,23 @@
           <w:sz w:val="18"/>
           <w:szCs w:val="18"/>
         </w:rPr>
-        <w:t xml:space="preserve">   Matter-of-fact, the sadness well buried.</w:t>
-      </w:r>
-    </w:p>
-    <w:p>
-      <w:pPr>
-        <w:keepNext/>
-        <w:spacing w:after="30" w:before="40"/>
-        <w:ind w:left="360"/>
-      </w:pPr>
-      <w:r>
-        <w:rPr>
-          <w:rFonts w:ascii="Arial" w:cs="Arial" w:eastAsia="Arial" w:hAnsi="Arial"/>
-          <w:color w:val="2E2433"/>
-          <w:sz w:val="25"/>
-          <w:szCs w:val="25"/>
-        </w:rPr>
-        <w:t xml:space="preserve">The badgers visit. They don't talk much, and none of them has ever leaned on me like that.</w:t>
+        <w:t xml:space="preserve">   Sad.</w:t>
+      </w:r>
+    </w:p>
+    <w:p>
+      <w:pPr>
+        <w:keepNext/>
+        <w:spacing w:after="30" w:before="40"/>
+        <w:ind w:left="360"/>
+      </w:pPr>
+      <w:r>
+        <w:rPr>
+          <w:rFonts w:ascii="Arial" w:cs="Arial" w:eastAsia="Arial" w:hAnsi="Arial"/>
+          <w:color w:val="2E2433"/>
+          <w:sz w:val="25"/>
+          <w:szCs w:val="25"/>
+        </w:rPr>
+        <w:t xml:space="preserve">It isn't so bad, but some animals are... Barely tolerable company.</w:t>
       </w:r>
     </w:p>
     <w:p>
@@ -17335,22 +17335,22 @@
           <w:rFonts w:ascii="Arial" w:cs="Arial" w:eastAsia="Arial" w:hAnsi="Arial"/>
           <w:b/>
           <w:bCs/>
-          <w:color w:val="2F7D4A"/>
-          <w:sz w:val="17"/>
-          <w:szCs w:val="17"/>
-        </w:rPr>
-        <w:t xml:space="preserve">   happy</w:t>
-      </w:r>
-      <w:r>
-        <w:rPr>
-          <w:rFonts w:ascii="Arial" w:cs="Arial" w:eastAsia="Arial" w:hAnsi="Arial"/>
-          <w:i/>
-          <w:iCs/>
-          <w:color w:val="2E2433"/>
-          <w:sz w:val="18"/>
-          <w:szCs w:val="18"/>
-        </w:rPr>
-        <w:t xml:space="preserve">   Dry joke, then fond.</w:t>
+          <w:color w:val="6B6B6B"/>
+          <w:sz w:val="17"/>
+          <w:szCs w:val="17"/>
+        </w:rPr>
+        <w:t xml:space="preserve">   neutral</w:t>
+      </w:r>
+      <w:r>
+        <w:rPr>
+          <w:rFonts w:ascii="Arial" w:cs="Arial" w:eastAsia="Arial" w:hAnsi="Arial"/>
+          <w:i/>
+          <w:iCs/>
+          <w:color w:val="2E2433"/>
+          <w:sz w:val="18"/>
+          <w:szCs w:val="18"/>
+        </w:rPr>
+        <w:t xml:space="preserve">   Teasing.</w:t>
       </w:r>
     </w:p>
     <w:p>
@@ -17443,23 +17443,23 @@
           <w:sz w:val="18"/>
           <w:szCs w:val="18"/>
         </w:rPr>
-        <w:t xml:space="preserve">   Instant, deadpan.</w:t>
-      </w:r>
-    </w:p>
-    <w:p>
-      <w:pPr>
-        <w:keepNext/>
-        <w:spacing w:after="30" w:before="40"/>
-        <w:ind w:left="360"/>
-      </w:pPr>
-      <w:r>
-        <w:rPr>
-          <w:rFonts w:ascii="Arial" w:cs="Arial" w:eastAsia="Arial" w:hAnsi="Arial"/>
-          <w:color w:val="2E2433"/>
-          <w:sz w:val="25"/>
-          <w:szCs w:val="25"/>
-        </w:rPr>
-        <w:t xml:space="preserve">Come back tomorrow. Bring the shovel, leave the axe, and wear that shirt again.</w:t>
+        <w:t xml:space="preserve">   Teasing.</w:t>
+      </w:r>
+    </w:p>
+    <w:p>
+      <w:pPr>
+        <w:keepNext/>
+        <w:spacing w:after="30" w:before="40"/>
+        <w:ind w:left="360"/>
+      </w:pPr>
+      <w:r>
+        <w:rPr>
+          <w:rFonts w:ascii="Arial" w:cs="Arial" w:eastAsia="Arial" w:hAnsi="Arial"/>
+          <w:color w:val="2E2433"/>
+          <w:sz w:val="25"/>
+          <w:szCs w:val="25"/>
+        </w:rPr>
+        <w:t xml:space="preserve">But I'll allow it. Bring the shovel tomorrow though.</w:t>
       </w:r>
     </w:p>
     <w:p>
@@ -17497,7 +17497,7 @@
           <w:sz w:val="18"/>
           <w:szCs w:val="18"/>
         </w:rPr>
-        <w:t xml:space="preserve">   Warm, playful; the last part comes quickly, before she can take it back.</w:t>
+        <w:t xml:space="preserve">   Happy.</w:t>
       </w:r>
     </w:p>
     <w:p>
@@ -17552,7 +17552,7 @@
           <w:sz w:val="25"/>
           <w:szCs w:val="25"/>
         </w:rPr>
-        <w:t xml:space="preserve">The ferns say you walked the miller's daughter to the footbridge. That's fine. I'm sure no branch will fall on her. Fairly sure.</w:t>
+        <w:t xml:space="preserve">The ferns tell me you were talking to the miller's daughter. I'm not jealous. But I might drop a branch near her, that's all.</w:t>
       </w:r>
     </w:p>
     <w:p>
@@ -17590,7 +17590,7 @@
           <w:sz w:val="18"/>
           <w:szCs w:val="18"/>
         </w:rPr>
-        <w:t xml:space="preserve">   Calm and pleasant, and jealous. The threat is polite.</w:t>
+        <w:t xml:space="preserve">   Jealous.</w:t>
       </w:r>
     </w:p>
     <w:p>
@@ -17624,7 +17624,7 @@
           <w:sz w:val="25"/>
           <w:szCs w:val="25"/>
         </w:rPr>
-        <w:t xml:space="preserve">Her father came by too. You've got till the end of the month. Then he hires someone with a saw.</w:t>
+        <w:t xml:space="preserve">Her father came by this morning. He'll give you until the end of the month. Then he hires someone with a saw.</w:t>
       </w:r>
     </w:p>
     <w:p>
@@ -17647,6 +17647,60 @@
           <w:rFonts w:ascii="Arial" w:cs="Arial" w:eastAsia="Arial" w:hAnsi="Arial"/>
           <w:b/>
           <w:bCs/>
+          <w:color w:val="6B6B6B"/>
+          <w:sz w:val="17"/>
+          <w:szCs w:val="17"/>
+        </w:rPr>
+        <w:t xml:space="preserve">   neutral</w:t>
+      </w:r>
+      <w:r>
+        <w:rPr>
+          <w:rFonts w:ascii="Arial" w:cs="Arial" w:eastAsia="Arial" w:hAnsi="Arial"/>
+          <w:i/>
+          <w:iCs/>
+          <w:color w:val="2E2433"/>
+          <w:sz w:val="18"/>
+          <w:szCs w:val="18"/>
+        </w:rPr>
+        <w:t xml:space="preserve">   Serious.</w:t>
+      </w:r>
+    </w:p>
+    <w:p>
+      <w:pPr>
+        <w:keepNext/>
+        <w:spacing w:after="30" w:before="40"/>
+        <w:ind w:left="360"/>
+      </w:pPr>
+      <w:r>
+        <w:rPr>
+          <w:rFonts w:ascii="Arial" w:cs="Arial" w:eastAsia="Arial" w:hAnsi="Arial"/>
+          <w:color w:val="2E2433"/>
+          <w:sz w:val="25"/>
+          <w:szCs w:val="25"/>
+        </w:rPr>
+        <w:t xml:space="preserve">Dig faster. I'd like to see another spring.</w:t>
+      </w:r>
+    </w:p>
+    <w:p>
+      <w:pPr>
+        <w:keepLines/>
+        <w:spacing w:after="140"/>
+        <w:ind w:left="360"/>
+      </w:pPr>
+      <w:r>
+        <w:rPr>
+          <w:rFonts w:ascii="Courier New" w:cs="Courier New" w:eastAsia="Courier New" w:hAnsi="Courier New"/>
+          <w:color w:val="7A6B78"/>
+          <w:sz w:val="16"/>
+          <w:szCs w:val="16"/>
+        </w:rPr>
+        <w:t xml:space="preserve">hazel_ch2_03</w:t>
+      </w:r>
+      <w:r>
+        <w:rPr>
+          <w:rFonts w:ascii="Arial" w:cs="Arial" w:eastAsia="Arial" w:hAnsi="Arial"/>
+          <w:b/>
+          <w:bCs/>
           <w:color w:val="3C6E9E"/>
           <w:sz w:val="17"/>
           <w:szCs w:val="17"/>
@@ -17662,61 +17716,7 @@
           <w:sz w:val="18"/>
           <w:szCs w:val="18"/>
         </w:rPr>
-        <w:t xml:space="preserve">   Calm on the surface; worry underneath.</w:t>
-      </w:r>
-    </w:p>
-    <w:p>
-      <w:pPr>
-        <w:keepNext/>
-        <w:spacing w:after="30" w:before="40"/>
-        <w:ind w:left="360"/>
-      </w:pPr>
-      <w:r>
-        <w:rPr>
-          <w:rFonts w:ascii="Arial" w:cs="Arial" w:eastAsia="Arial" w:hAnsi="Arial"/>
-          <w:color w:val="2E2433"/>
-          <w:sz w:val="25"/>
-          <w:szCs w:val="25"/>
-        </w:rPr>
-        <w:t xml:space="preserve">So dig faster. I've started making plans for summer, and you're in most of them.</w:t>
-      </w:r>
-    </w:p>
-    <w:p>
-      <w:pPr>
-        <w:keepLines/>
-        <w:spacing w:after="140"/>
-        <w:ind w:left="360"/>
-      </w:pPr>
-      <w:r>
-        <w:rPr>
-          <w:rFonts w:ascii="Courier New" w:cs="Courier New" w:eastAsia="Courier New" w:hAnsi="Courier New"/>
-          <w:color w:val="7A6B78"/>
-          <w:sz w:val="16"/>
-          <w:szCs w:val="16"/>
-        </w:rPr>
-        <w:t xml:space="preserve">hazel_ch2_03</w:t>
-      </w:r>
-      <w:r>
-        <w:rPr>
-          <w:rFonts w:ascii="Arial" w:cs="Arial" w:eastAsia="Arial" w:hAnsi="Arial"/>
-          <w:b/>
-          <w:bCs/>
-          <w:color w:val="B0457A"/>
-          <w:sz w:val="17"/>
-          <w:szCs w:val="17"/>
-        </w:rPr>
-        <w:t xml:space="preserve">   shy</w:t>
-      </w:r>
-      <w:r>
-        <w:rPr>
-          <w:rFonts w:ascii="Arial" w:cs="Arial" w:eastAsia="Arial" w:hAnsi="Arial"/>
-          <w:i/>
-          <w:iCs/>
-          <w:color w:val="2E2433"/>
-          <w:sz w:val="18"/>
-          <w:szCs w:val="18"/>
-        </w:rPr>
-        <w:t xml:space="preserve">   Light on top, real fear underneath; the second half is softer.</w:t>
+        <w:t xml:space="preserve">   Scared.</w:t>
       </w:r>
     </w:p>
     <w:p>
@@ -17771,7 +17771,7 @@
           <w:sz w:val="25"/>
           <w:szCs w:val="25"/>
         </w:rPr>
-        <w:t xml:space="preserve">I know. The ferns mentioned that too.</w:t>
+        <w:t xml:space="preserve">I know. You were still gone forty minutes, not that I was counting.</w:t>
       </w:r>
     </w:p>
     <w:p>
@@ -17794,38 +17794,38 @@
           <w:rFonts w:ascii="Arial" w:cs="Arial" w:eastAsia="Arial" w:hAnsi="Arial"/>
           <w:b/>
           <w:bCs/>
-          <w:color w:val="B0457A"/>
-          <w:sz w:val="17"/>
-          <w:szCs w:val="17"/>
-        </w:rPr>
-        <w:t xml:space="preserve">   shy</w:t>
-      </w:r>
-      <w:r>
-        <w:rPr>
-          <w:rFonts w:ascii="Arial" w:cs="Arial" w:eastAsia="Arial" w:hAnsi="Arial"/>
-          <w:i/>
-          <w:iCs/>
-          <w:color w:val="2E2433"/>
-          <w:sz w:val="18"/>
-          <w:szCs w:val="18"/>
-        </w:rPr>
-        <w:t xml:space="preserve">   Soft, caught out.</w:t>
-      </w:r>
-    </w:p>
-    <w:p>
-      <w:pPr>
-        <w:keepNext/>
-        <w:spacing w:after="30" w:before="40"/>
-        <w:ind w:left="360"/>
-      </w:pPr>
-      <w:r>
-        <w:rPr>
-          <w:rFonts w:ascii="Arial" w:cs="Arial" w:eastAsia="Arial" w:hAnsi="Arial"/>
-          <w:color w:val="2E2433"/>
-          <w:sz w:val="25"/>
-          <w:szCs w:val="25"/>
-        </w:rPr>
-        <w:t xml:space="preserve">Eat your lunch. She makes good bread, apparently. Nobody's ever walked me to a footbridge.</w:t>
+          <w:color w:val="B23A3A"/>
+          <w:sz w:val="17"/>
+          <w:szCs w:val="17"/>
+        </w:rPr>
+        <w:t xml:space="preserve">   angry</w:t>
+      </w:r>
+      <w:r>
+        <w:rPr>
+          <w:rFonts w:ascii="Arial" w:cs="Arial" w:eastAsia="Arial" w:hAnsi="Arial"/>
+          <w:i/>
+          <w:iCs/>
+          <w:color w:val="2E2433"/>
+          <w:sz w:val="18"/>
+          <w:szCs w:val="18"/>
+        </w:rPr>
+        <w:t xml:space="preserve">   Jealous.</w:t>
+      </w:r>
+    </w:p>
+    <w:p>
+      <w:pPr>
+        <w:keepNext/>
+        <w:spacing w:after="30" w:before="40"/>
+        <w:ind w:left="360"/>
+      </w:pPr>
+      <w:r>
+        <w:rPr>
+          <w:rFonts w:ascii="Arial" w:cs="Arial" w:eastAsia="Arial" w:hAnsi="Arial"/>
+          <w:color w:val="2E2433"/>
+          <w:sz w:val="25"/>
+          <w:szCs w:val="25"/>
+        </w:rPr>
+        <w:t xml:space="preserve">Eat your lunch. I'm sure her bread is very good. I wouldn't know.</w:t>
       </w:r>
     </w:p>
     <w:p>
@@ -17848,22 +17848,22 @@
           <w:rFonts w:ascii="Arial" w:cs="Arial" w:eastAsia="Arial" w:hAnsi="Arial"/>
           <w:b/>
           <w:bCs/>
-          <w:color w:val="2F7D4A"/>
-          <w:sz w:val="17"/>
-          <w:szCs w:val="17"/>
-        </w:rPr>
-        <w:t xml:space="preserve">   happy</w:t>
-      </w:r>
-      <w:r>
-        <w:rPr>
-          <w:rFonts w:ascii="Arial" w:cs="Arial" w:eastAsia="Arial" w:hAnsi="Arial"/>
-          <w:i/>
-          <w:iCs/>
-          <w:color w:val="2E2433"/>
-          <w:sz w:val="18"/>
-          <w:szCs w:val="18"/>
-        </w:rPr>
-        <w:t xml:space="preserve">   A tiny bit petty, mostly wistful.</w:t>
+          <w:color w:val="B23A3A"/>
+          <w:sz w:val="17"/>
+          <w:szCs w:val="17"/>
+        </w:rPr>
+        <w:t xml:space="preserve">   angry</w:t>
+      </w:r>
+      <w:r>
+        <w:rPr>
+          <w:rFonts w:ascii="Arial" w:cs="Arial" w:eastAsia="Arial" w:hAnsi="Arial"/>
+          <w:i/>
+          <w:iCs/>
+          <w:color w:val="2E2433"/>
+          <w:sz w:val="18"/>
+          <w:szCs w:val="18"/>
+        </w:rPr>
+        <w:t xml:space="preserve">   Jealous.</w:t>
       </w:r>
     </w:p>
     <w:p>
@@ -17941,22 +17941,22 @@
           <w:rFonts w:ascii="Arial" w:cs="Arial" w:eastAsia="Arial" w:hAnsi="Arial"/>
           <w:b/>
           <w:bCs/>
-          <w:color w:val="B23A3A"/>
-          <w:sz w:val="17"/>
-          <w:szCs w:val="17"/>
-        </w:rPr>
-        <w:t xml:space="preserve">   angry</w:t>
-      </w:r>
-      <w:r>
-        <w:rPr>
-          <w:rFonts w:ascii="Arial" w:cs="Arial" w:eastAsia="Arial" w:hAnsi="Arial"/>
-          <w:i/>
-          <w:iCs/>
-          <w:color w:val="2E2433"/>
-          <w:sz w:val="18"/>
-          <w:szCs w:val="18"/>
-        </w:rPr>
-        <w:t xml:space="preserve">   Clipped, flustered.</w:t>
+          <w:color w:val="B0457A"/>
+          <w:sz w:val="17"/>
+          <w:szCs w:val="17"/>
+        </w:rPr>
+        <w:t xml:space="preserve">   shy</w:t>
+      </w:r>
+      <w:r>
+        <w:rPr>
+          <w:rFonts w:ascii="Arial" w:cs="Arial" w:eastAsia="Arial" w:hAnsi="Arial"/>
+          <w:i/>
+          <w:iCs/>
+          <w:color w:val="2E2433"/>
+          <w:sz w:val="18"/>
+          <w:szCs w:val="18"/>
+        </w:rPr>
+        <w:t xml:space="preserve">   Flustered.</w:t>
       </w:r>
     </w:p>
     <w:p>
@@ -17990,7 +17990,7 @@
           <w:sz w:val="25"/>
           <w:szCs w:val="25"/>
         </w:rPr>
-        <w:t xml:space="preserve">Dig your trench. And stop looking at my leaves.</w:t>
+        <w:t xml:space="preserve">Dig your trench. Sleeves up!</w:t>
       </w:r>
     </w:p>
     <w:p>
@@ -18028,7 +18028,7 @@
           <w:sz w:val="18"/>
           <w:szCs w:val="18"/>
         </w:rPr>
-        <w:t xml:space="preserve">   Mortified, very dignified about it.</w:t>
+        <w:t xml:space="preserve">   Flustered.</w:t>
       </w:r>
     </w:p>
     <w:p>
@@ -18083,7 +18083,7 @@
           <w:sz w:val="25"/>
           <w:szCs w:val="25"/>
         </w:rPr>
-        <w:t xml:space="preserve">It's fine. It's the roots letting go of the old wall. They've held it forty years. They're making a fuss.</w:t>
+        <w:t xml:space="preserve">It's fine. It's just roots. They have to let go of the old wall even if it hurts.</w:t>
       </w:r>
     </w:p>
     <w:p>
@@ -18121,7 +18121,7 @@
           <w:sz w:val="18"/>
           <w:szCs w:val="18"/>
         </w:rPr>
-        <w:t xml:space="preserve">   Strained. Trying to sound calm and not quite managing.</w:t>
+        <w:t xml:space="preserve">   Sad.</w:t>
       </w:r>
     </w:p>
     <w:p>
@@ -18155,7 +18155,7 @@
           <w:sz w:val="25"/>
           <w:szCs w:val="25"/>
         </w:rPr>
-        <w:t xml:space="preserve">You didn't have to stay. You're soaked. You'll get ill, and then I'll have to look after you, and I've no idea how.</w:t>
+        <w:t xml:space="preserve">You're shaking. Come in closer, there's a hollow in the trunk that fits you.</w:t>
       </w:r>
     </w:p>
     <w:p>
@@ -18193,23 +18193,23 @@
           <w:sz w:val="18"/>
           <w:szCs w:val="18"/>
         </w:rPr>
-        <w:t xml:space="preserve">   Gruff, grateful underneath.</w:t>
-      </w:r>
-    </w:p>
-    <w:p>
-      <w:pPr>
-        <w:keepNext/>
-        <w:spacing w:after="30" w:before="40"/>
-        <w:ind w:left="360"/>
-      </w:pPr>
-      <w:r>
-        <w:rPr>
-          <w:rFonts w:ascii="Arial" w:cs="Arial" w:eastAsia="Arial" w:hAnsi="Arial"/>
-          <w:color w:val="2E2433"/>
-          <w:sz w:val="25"/>
-          <w:szCs w:val="25"/>
-        </w:rPr>
-        <w:t xml:space="preserve">Talk to me. About anything. What did you have for breakfast?</w:t>
+        <w:t xml:space="preserve">   Caring.</w:t>
+      </w:r>
+    </w:p>
+    <w:p>
+      <w:pPr>
+        <w:keepNext/>
+        <w:spacing w:after="30" w:before="40"/>
+        <w:ind w:left="360"/>
+      </w:pPr>
+      <w:r>
+        <w:rPr>
+          <w:rFonts w:ascii="Arial" w:cs="Arial" w:eastAsia="Arial" w:hAnsi="Arial"/>
+          <w:color w:val="2E2433"/>
+          <w:sz w:val="25"/>
+          <w:szCs w:val="25"/>
+        </w:rPr>
+        <w:t xml:space="preserve">Talk to me. About anything. Your voice helps me get through it.</w:t>
       </w:r>
     </w:p>
     <w:p>
@@ -18247,7 +18247,7 @@
           <w:sz w:val="18"/>
           <w:szCs w:val="18"/>
         </w:rPr>
-        <w:t xml:space="preserve">   Small, strained; asking for help is hard for her, so she makes it about breakfast.</w:t>
+        <w:t xml:space="preserve">   Scared.</w:t>
       </w:r>
     </w:p>
     <w:p>
@@ -18340,7 +18340,7 @@
           <w:sz w:val="18"/>
           <w:szCs w:val="18"/>
         </w:rPr>
-        <w:t xml:space="preserve">   Drifting into a memory; fond, a little wry.</w:t>
+        <w:t xml:space="preserve">   Happy.</w:t>
       </w:r>
     </w:p>
     <w:p>
@@ -18374,7 +18374,7 @@
           <w:sz w:val="25"/>
           <w:szCs w:val="25"/>
         </w:rPr>
-        <w:t xml:space="preserve">You're still warm. I'll keep you.</w:t>
+        <w:t xml:space="preserve">You're still warm. Good.</w:t>
       </w:r>
     </w:p>
     <w:p>
@@ -18412,7 +18412,7 @@
           <w:sz w:val="18"/>
           <w:szCs w:val="18"/>
         </w:rPr>
-        <w:t xml:space="preserve">   Barely a murmur, to herself as much as to you.</w:t>
+        <w:t xml:space="preserve">   Shy.</w:t>
       </w:r>
     </w:p>
     <w:p>
@@ -18490,22 +18490,22 @@
           <w:rFonts w:ascii="Arial" w:cs="Arial" w:eastAsia="Arial" w:hAnsi="Arial"/>
           <w:b/>
           <w:bCs/>
-          <w:color w:val="2F7D4A"/>
-          <w:sz w:val="17"/>
-          <w:szCs w:val="17"/>
-        </w:rPr>
-        <w:t xml:space="preserve">   happy</w:t>
-      </w:r>
-      <w:r>
-        <w:rPr>
-          <w:rFonts w:ascii="Arial" w:cs="Arial" w:eastAsia="Arial" w:hAnsi="Arial"/>
-          <w:i/>
-          <w:iCs/>
-          <w:color w:val="2E2433"/>
-          <w:sz w:val="18"/>
-          <w:szCs w:val="18"/>
-        </w:rPr>
-        <w:t xml:space="preserve">   Perking up, wicked.</w:t>
+          <w:color w:val="6B6B6B"/>
+          <w:sz w:val="17"/>
+          <w:szCs w:val="17"/>
+        </w:rPr>
+        <w:t xml:space="preserve">   neutral</w:t>
+      </w:r>
+      <w:r>
+        <w:rPr>
+          <w:rFonts w:ascii="Arial" w:cs="Arial" w:eastAsia="Arial" w:hAnsi="Arial"/>
+          <w:i/>
+          <w:iCs/>
+          <w:color w:val="2E2433"/>
+          <w:sz w:val="18"/>
+          <w:szCs w:val="18"/>
+        </w:rPr>
+        <w:t xml:space="preserve">   Teasing.</w:t>
       </w:r>
     </w:p>
     <w:p>
@@ -18577,7 +18577,7 @@
           <w:sz w:val="18"/>
           <w:szCs w:val="18"/>
         </w:rPr>
-        <w:t xml:space="preserve">   Laughing through the pain.</w:t>
+        <w:t xml:space="preserve">   Laughing.</w:t>
       </w:r>
     </w:p>
     <w:p>
@@ -18632,7 +18632,7 @@
           <w:sz w:val="25"/>
           <w:szCs w:val="25"/>
         </w:rPr>
-        <w:t xml:space="preserve">Forty springs he's sent people with axes. That's the first time he's ever touched me.</w:t>
+        <w:t xml:space="preserve">He's never done that. Forty springs, and he's never once done that.</w:t>
       </w:r>
     </w:p>
     <w:p>
@@ -18655,22 +18655,22 @@
           <w:rFonts w:ascii="Arial" w:cs="Arial" w:eastAsia="Arial" w:hAnsi="Arial"/>
           <w:b/>
           <w:bCs/>
-          <w:color w:val="B7791F"/>
-          <w:sz w:val="17"/>
-          <w:szCs w:val="17"/>
-        </w:rPr>
-        <w:t xml:space="preserve">   surprised</w:t>
-      </w:r>
-      <w:r>
-        <w:rPr>
-          <w:rFonts w:ascii="Arial" w:cs="Arial" w:eastAsia="Arial" w:hAnsi="Arial"/>
-          <w:i/>
-          <w:iCs/>
-          <w:color w:val="2E2433"/>
-          <w:sz w:val="18"/>
-          <w:szCs w:val="18"/>
-        </w:rPr>
-        <w:t xml:space="preserve">   Quietly moved. Almost a whisper.</w:t>
+          <w:color w:val="2F7D4A"/>
+          <w:sz w:val="17"/>
+          <w:szCs w:val="17"/>
+        </w:rPr>
+        <w:t xml:space="preserve">   happy</w:t>
+      </w:r>
+      <w:r>
+        <w:rPr>
+          <w:rFonts w:ascii="Arial" w:cs="Arial" w:eastAsia="Arial" w:hAnsi="Arial"/>
+          <w:i/>
+          <w:iCs/>
+          <w:color w:val="2E2433"/>
+          <w:sz w:val="18"/>
+          <w:szCs w:val="18"/>
+        </w:rPr>
+        <w:t xml:space="preserve">   Happy.</w:t>
       </w:r>
     </w:p>
     <w:p>
@@ -18704,7 +18704,7 @@
           <w:sz w:val="25"/>
           <w:szCs w:val="25"/>
         </w:rPr>
-        <w:t xml:space="preserve">I can go as far as my roots do. Thanks to someone, that's quite far now. Far enough to follow you home, if I felt like it.</w:t>
+        <w:t xml:space="preserve">I can walk as far as my roots go. They go a long way now. Thanks to someone.</w:t>
       </w:r>
     </w:p>
     <w:p>
@@ -18742,23 +18742,23 @@
           <w:sz w:val="18"/>
           <w:szCs w:val="18"/>
         </w:rPr>
-        <w:t xml:space="preserve">   Shy and warm; won't say your name. The last part is a test.</w:t>
-      </w:r>
-    </w:p>
-    <w:p>
-      <w:pPr>
-        <w:keepNext/>
-        <w:spacing w:after="30" w:before="40"/>
-        <w:ind w:left="360"/>
-      </w:pPr>
-      <w:r>
-        <w:rPr>
-          <w:rFonts w:ascii="Arial" w:cs="Arial" w:eastAsia="Arial" w:hAnsi="Arial"/>
-          <w:color w:val="2E2433"/>
-          <w:sz w:val="25"/>
-          <w:szCs w:val="25"/>
-        </w:rPr>
-        <w:t xml:space="preserve">The moss on the east side is softer than it looks. I've been meaning to mention that for about a week.</w:t>
+        <w:t xml:space="preserve">   Shy.</w:t>
+      </w:r>
+    </w:p>
+    <w:p>
+      <w:pPr>
+        <w:keepNext/>
+        <w:spacing w:after="30" w:before="40"/>
+        <w:ind w:left="360"/>
+      </w:pPr>
+      <w:r>
+        <w:rPr>
+          <w:rFonts w:ascii="Arial" w:cs="Arial" w:eastAsia="Arial" w:hAnsi="Arial"/>
+          <w:color w:val="2E2433"/>
+          <w:sz w:val="25"/>
+          <w:szCs w:val="25"/>
+        </w:rPr>
+        <w:t xml:space="preserve">The moss on the east side is softer than it looks.</w:t>
       </w:r>
     </w:p>
     <w:p>
@@ -18796,23 +18796,23 @@
           <w:sz w:val="18"/>
           <w:szCs w:val="18"/>
         </w:rPr>
-        <w:t xml:space="preserve">   Low and slow. An invitation she's pretending is a fact about moss.</w:t>
-      </w:r>
-    </w:p>
-    <w:p>
-      <w:pPr>
-        <w:keepNext/>
-        <w:spacing w:after="30" w:before="40"/>
-        <w:ind w:left="360"/>
-      </w:pPr>
-      <w:r>
-        <w:rPr>
-          <w:rFonts w:ascii="Arial" w:cs="Arial" w:eastAsia="Arial" w:hAnsi="Arial"/>
-          <w:color w:val="2E2433"/>
-          <w:sz w:val="25"/>
-          <w:szCs w:val="25"/>
-        </w:rPr>
-        <w:t xml:space="preserve">Stay tonight. I'll keep the rain off. I'm not promising anything else.</w:t>
+        <w:t xml:space="preserve">   Flirting.</w:t>
+      </w:r>
+    </w:p>
+    <w:p>
+      <w:pPr>
+        <w:keepNext/>
+        <w:spacing w:after="30" w:before="40"/>
+        <w:ind w:left="360"/>
+      </w:pPr>
+      <w:r>
+        <w:rPr>
+          <w:rFonts w:ascii="Arial" w:cs="Arial" w:eastAsia="Arial" w:hAnsi="Arial"/>
+          <w:color w:val="2E2433"/>
+          <w:sz w:val="25"/>
+          <w:szCs w:val="25"/>
+        </w:rPr>
+        <w:t xml:space="preserve">Stay tonight. I'll keep the rain off.</w:t>
       </w:r>
     </w:p>
     <w:p>
@@ -18835,22 +18835,22 @@
           <w:rFonts w:ascii="Arial" w:cs="Arial" w:eastAsia="Arial" w:hAnsi="Arial"/>
           <w:b/>
           <w:bCs/>
-          <w:color w:val="2F7D4A"/>
-          <w:sz w:val="17"/>
-          <w:szCs w:val="17"/>
-        </w:rPr>
-        <w:t xml:space="preserve">   happy</w:t>
-      </w:r>
-      <w:r>
-        <w:rPr>
-          <w:rFonts w:ascii="Arial" w:cs="Arial" w:eastAsia="Arial" w:hAnsi="Arial"/>
-          <w:i/>
-          <w:iCs/>
-          <w:color w:val="2E2433"/>
-          <w:sz w:val="18"/>
-          <w:szCs w:val="18"/>
-        </w:rPr>
-        <w:t xml:space="preserve">   Warm, certain, a little wicked at the end.</w:t>
+          <w:color w:val="7A3FB0"/>
+          <w:sz w:val="17"/>
+          <w:szCs w:val="17"/>
+        </w:rPr>
+        <w:t xml:space="preserve">   teasing</w:t>
+      </w:r>
+      <w:r>
+        <w:rPr>
+          <w:rFonts w:ascii="Arial" w:cs="Arial" w:eastAsia="Arial" w:hAnsi="Arial"/>
+          <w:i/>
+          <w:iCs/>
+          <w:color w:val="2E2433"/>
+          <w:sz w:val="18"/>
+          <w:szCs w:val="18"/>
+        </w:rPr>
+        <w:t xml:space="preserve">   Flirting.</w:t>
       </w:r>
     </w:p>
     <w:p>
@@ -18905,7 +18905,7 @@
           <w:sz w:val="25"/>
           <w:szCs w:val="25"/>
         </w:rPr>
-        <w:t xml:space="preserve">Two hundred years people have walked past this tree. Not one of them ever lay down under it. Shift over, you're on a root.</w:t>
+        <w:t xml:space="preserve">Two hundred springs I've watched people walk past this tree. Not one of them ever lay down under it.</w:t>
       </w:r>
     </w:p>
     <w:p>
@@ -18928,38 +18928,38 @@
           <w:rFonts w:ascii="Arial" w:cs="Arial" w:eastAsia="Arial" w:hAnsi="Arial"/>
           <w:b/>
           <w:bCs/>
-          <w:color w:val="6B6B6B"/>
-          <w:sz w:val="17"/>
-          <w:szCs w:val="17"/>
-        </w:rPr>
-        <w:t xml:space="preserve">   neutral</w:t>
-      </w:r>
-      <w:r>
-        <w:rPr>
-          <w:rFonts w:ascii="Arial" w:cs="Arial" w:eastAsia="Arial" w:hAnsi="Arial"/>
-          <w:i/>
-          <w:iCs/>
-          <w:color w:val="2E2433"/>
-          <w:sz w:val="18"/>
-          <w:szCs w:val="18"/>
-        </w:rPr>
-        <w:t xml:space="preserve">   Slow and calm, quietly amazed, then practical.</w:t>
-      </w:r>
-    </w:p>
-    <w:p>
-      <w:pPr>
-        <w:keepNext/>
-        <w:spacing w:after="30" w:before="40"/>
-        <w:ind w:left="360"/>
-      </w:pPr>
-      <w:r>
-        <w:rPr>
-          <w:rFonts w:ascii="Arial" w:cs="Arial" w:eastAsia="Arial" w:hAnsi="Arial"/>
-          <w:color w:val="2E2433"/>
-          <w:sz w:val="25"/>
-          <w:szCs w:val="25"/>
-        </w:rPr>
-        <w:t xml:space="preserve">The badgers are watching. I told them to go away. Nobody in this grove listens to me.</w:t>
+          <w:color w:val="B7791F"/>
+          <w:sz w:val="17"/>
+          <w:szCs w:val="17"/>
+        </w:rPr>
+        <w:t xml:space="preserve">   surprised</w:t>
+      </w:r>
+      <w:r>
+        <w:rPr>
+          <w:rFonts w:ascii="Arial" w:cs="Arial" w:eastAsia="Arial" w:hAnsi="Arial"/>
+          <w:i/>
+          <w:iCs/>
+          <w:color w:val="2E2433"/>
+          <w:sz w:val="18"/>
+          <w:szCs w:val="18"/>
+        </w:rPr>
+        <w:t xml:space="preserve">   Surprised.</w:t>
+      </w:r>
+    </w:p>
+    <w:p>
+      <w:pPr>
+        <w:keepNext/>
+        <w:spacing w:after="30" w:before="40"/>
+        <w:ind w:left="360"/>
+      </w:pPr>
+      <w:r>
+        <w:rPr>
+          <w:rFonts w:ascii="Arial" w:cs="Arial" w:eastAsia="Arial" w:hAnsi="Arial"/>
+          <w:color w:val="2E2433"/>
+          <w:sz w:val="25"/>
+          <w:szCs w:val="25"/>
+        </w:rPr>
+        <w:t xml:space="preserve">The animals are watching. I told them to go away. Nobody in this grove listens to me.</w:t>
       </w:r>
     </w:p>
     <w:p>
@@ -18982,22 +18982,22 @@
           <w:rFonts w:ascii="Arial" w:cs="Arial" w:eastAsia="Arial" w:hAnsi="Arial"/>
           <w:b/>
           <w:bCs/>
-          <w:color w:val="6B6B6B"/>
-          <w:sz w:val="17"/>
-          <w:szCs w:val="17"/>
-        </w:rPr>
-        <w:t xml:space="preserve">   neutral</w:t>
-      </w:r>
-      <w:r>
-        <w:rPr>
-          <w:rFonts w:ascii="Arial" w:cs="Arial" w:eastAsia="Arial" w:hAnsi="Arial"/>
-          <w:i/>
-          <w:iCs/>
-          <w:color w:val="2E2433"/>
-          <w:sz w:val="18"/>
-          <w:szCs w:val="18"/>
-        </w:rPr>
-        <w:t xml:space="preserve">   Bone-dry, a little shy under it.</w:t>
+          <w:color w:val="B0457A"/>
+          <w:sz w:val="17"/>
+          <w:szCs w:val="17"/>
+        </w:rPr>
+        <w:t xml:space="preserve">   shy</w:t>
+      </w:r>
+      <w:r>
+        <w:rPr>
+          <w:rFonts w:ascii="Arial" w:cs="Arial" w:eastAsia="Arial" w:hAnsi="Arial"/>
+          <w:i/>
+          <w:iCs/>
+          <w:color w:val="2E2433"/>
+          <w:sz w:val="18"/>
+          <w:szCs w:val="18"/>
+        </w:rPr>
+        <w:t xml:space="preserve">   Shy.</w:t>
       </w:r>
     </w:p>
     <w:p>
@@ -19054,22 +19054,22 @@
           <w:rFonts w:ascii="Arial" w:cs="Arial" w:eastAsia="Arial" w:hAnsi="Arial"/>
           <w:b/>
           <w:bCs/>
-          <w:color w:val="B0457A"/>
-          <w:sz w:val="17"/>
-          <w:szCs w:val="17"/>
-        </w:rPr>
-        <w:t xml:space="preserve">   shy</w:t>
-      </w:r>
-      <w:r>
-        <w:rPr>
-          <w:rFonts w:ascii="Arial" w:cs="Arial" w:eastAsia="Arial" w:hAnsi="Arial"/>
-          <w:i/>
-          <w:iCs/>
-          <w:color w:val="2E2433"/>
-          <w:sz w:val="18"/>
-          <w:szCs w:val="18"/>
-        </w:rPr>
-        <w:t xml:space="preserve">   Soft, almost accusing. Fond.</w:t>
+          <w:color w:val="7A3FB0"/>
+          <w:sz w:val="17"/>
+          <w:szCs w:val="17"/>
+        </w:rPr>
+        <w:t xml:space="preserve">   teasing</w:t>
+      </w:r>
+      <w:r>
+        <w:rPr>
+          <w:rFonts w:ascii="Arial" w:cs="Arial" w:eastAsia="Arial" w:hAnsi="Arial"/>
+          <w:i/>
+          <w:iCs/>
+          <w:color w:val="2E2433"/>
+          <w:sz w:val="18"/>
+          <w:szCs w:val="18"/>
+        </w:rPr>
+        <w:t xml:space="preserve">   Flirting.</w:t>
       </w:r>
     </w:p>
     <w:p>
@@ -19141,23 +19141,23 @@
           <w:sz w:val="18"/>
           <w:szCs w:val="18"/>
         </w:rPr>
-        <w:t xml:space="preserve">   Deadpan joke; nervous underneath.</w:t>
-      </w:r>
-    </w:p>
-    <w:p>
-      <w:pPr>
-        <w:keepNext/>
-        <w:spacing w:after="30" w:before="40"/>
-        <w:ind w:left="360"/>
-      </w:pPr>
-      <w:r>
-        <w:rPr>
-          <w:rFonts w:ascii="Arial" w:cs="Arial" w:eastAsia="Arial" w:hAnsi="Arial"/>
-          <w:color w:val="2E2433"/>
-          <w:sz w:val="25"/>
-          <w:szCs w:val="25"/>
-        </w:rPr>
-        <w:t xml:space="preserve">Slowly. I've had two hundred years of nothing happening. I'd like this to take a while.</w:t>
+        <w:t xml:space="preserve">   Nervous.</w:t>
+      </w:r>
+    </w:p>
+    <w:p>
+      <w:pPr>
+        <w:keepNext/>
+        <w:spacing w:after="30" w:before="40"/>
+        <w:ind w:left="360"/>
+      </w:pPr>
+      <w:r>
+        <w:rPr>
+          <w:rFonts w:ascii="Arial" w:cs="Arial" w:eastAsia="Arial" w:hAnsi="Arial"/>
+          <w:color w:val="2E2433"/>
+          <w:sz w:val="25"/>
+          <w:szCs w:val="25"/>
+        </w:rPr>
+        <w:t xml:space="preserve">Slowly. I've got all the time in the world, and I'd like to spend some of it on this.</w:t>
       </w:r>
     </w:p>
     <w:p>
@@ -19180,22 +19180,22 @@
           <w:rFonts w:ascii="Arial" w:cs="Arial" w:eastAsia="Arial" w:hAnsi="Arial"/>
           <w:b/>
           <w:bCs/>
-          <w:color w:val="B0457A"/>
-          <w:sz w:val="17"/>
-          <w:szCs w:val="17"/>
-        </w:rPr>
-        <w:t xml:space="preserve">   shy</w:t>
-      </w:r>
-      <w:r>
-        <w:rPr>
-          <w:rFonts w:ascii="Arial" w:cs="Arial" w:eastAsia="Arial" w:hAnsi="Arial"/>
-          <w:i/>
-          <w:iCs/>
-          <w:color w:val="2E2433"/>
-          <w:sz w:val="18"/>
-          <w:szCs w:val="18"/>
-        </w:rPr>
-        <w:t xml:space="preserve">   Calm, warm, certain.</w:t>
+          <w:color w:val="7A3FB0"/>
+          <w:sz w:val="17"/>
+          <w:szCs w:val="17"/>
+        </w:rPr>
+        <w:t xml:space="preserve">   teasing</w:t>
+      </w:r>
+      <w:r>
+        <w:rPr>
+          <w:rFonts w:ascii="Arial" w:cs="Arial" w:eastAsia="Arial" w:hAnsi="Arial"/>
+          <w:i/>
+          <w:iCs/>
+          <w:color w:val="2E2433"/>
+          <w:sz w:val="18"/>
+          <w:szCs w:val="18"/>
+        </w:rPr>
+        <w:t xml:space="preserve">   Flirting.</w:t>
       </w:r>
     </w:p>
     <w:p>
@@ -19229,7 +19229,7 @@
           <w:sz w:val="25"/>
           <w:szCs w:val="25"/>
         </w:rPr>
-        <w:t xml:space="preserve">Don't look at the leaves. They're being ridiculous.</w:t>
+        <w:t xml:space="preserve">Don't... look at me like that.</w:t>
       </w:r>
     </w:p>
     <w:p>
@@ -19267,115 +19267,7 @@
           <w:sz w:val="18"/>
           <w:szCs w:val="18"/>
         </w:rPr>
-        <w:t xml:space="preserve">   Embarrassed. She can't control them and she knows you know.</w:t>
-      </w:r>
-    </w:p>
-    <w:p>
-      <w:pPr>
-        <w:keepNext/>
-        <w:spacing w:after="30" w:before="40"/>
-        <w:ind w:left="360"/>
-      </w:pPr>
-      <w:r>
-        <w:rPr>
-          <w:rFonts w:ascii="Arial" w:cs="Arial" w:eastAsia="Arial" w:hAnsi="Arial"/>
-          <w:color w:val="2E2433"/>
-          <w:sz w:val="25"/>
-          <w:szCs w:val="25"/>
-        </w:rPr>
-        <w:t xml:space="preserve">And don't tell the ferns. They'll want details.</w:t>
-      </w:r>
-    </w:p>
-    <w:p>
-      <w:pPr>
-        <w:keepLines/>
-        <w:spacing w:after="140"/>
-        <w:ind w:left="360"/>
-      </w:pPr>
-      <w:r>
-        <w:rPr>
-          <w:rFonts w:ascii="Courier New" w:cs="Courier New" w:eastAsia="Courier New" w:hAnsi="Courier New"/>
-          <w:color w:val="7A6B78"/>
-          <w:sz w:val="16"/>
-          <w:szCs w:val="16"/>
-        </w:rPr>
-        <w:t xml:space="preserve">hazel_night_22</w:t>
-      </w:r>
-      <w:r>
-        <w:rPr>
-          <w:rFonts w:ascii="Arial" w:cs="Arial" w:eastAsia="Arial" w:hAnsi="Arial"/>
-          <w:b/>
-          <w:bCs/>
-          <w:color w:val="2F7D4A"/>
-          <w:sz w:val="17"/>
-          <w:szCs w:val="17"/>
-        </w:rPr>
-        <w:t xml:space="preserve">   happy</w:t>
-      </w:r>
-      <w:r>
-        <w:rPr>
-          <w:rFonts w:ascii="Arial" w:cs="Arial" w:eastAsia="Arial" w:hAnsi="Arial"/>
-          <w:i/>
-          <w:iCs/>
-          <w:color w:val="2E2433"/>
-          <w:sz w:val="18"/>
-          <w:szCs w:val="18"/>
-        </w:rPr>
-        <w:t xml:space="preserve">   Hushed, smiling.</w:t>
-      </w:r>
-    </w:p>
-    <w:p>
-      <w:pPr>
-        <w:keepNext/>
-        <w:spacing w:after="30" w:before="40"/>
-        <w:ind w:left="360"/>
-      </w:pPr>
-      <w:r>
-        <w:rPr>
-          <w:rFonts w:ascii="Arial" w:cs="Arial" w:eastAsia="Arial" w:hAnsi="Arial"/>
-          <w:color w:val="2E2433"/>
-          <w:sz w:val="25"/>
-          <w:szCs w:val="25"/>
-        </w:rPr>
-        <w:t xml:space="preserve">Sleep. I'll wake you if the miller comes. I might not.</w:t>
-      </w:r>
-    </w:p>
-    <w:p>
-      <w:pPr>
-        <w:keepLines/>
-        <w:spacing w:after="140"/>
-        <w:ind w:left="360"/>
-      </w:pPr>
-      <w:r>
-        <w:rPr>
-          <w:rFonts w:ascii="Courier New" w:cs="Courier New" w:eastAsia="Courier New" w:hAnsi="Courier New"/>
-          <w:color w:val="7A6B78"/>
-          <w:sz w:val="16"/>
-          <w:szCs w:val="16"/>
-        </w:rPr>
-        <w:t xml:space="preserve">hazel_night_23</w:t>
-      </w:r>
-      <w:r>
-        <w:rPr>
-          <w:rFonts w:ascii="Arial" w:cs="Arial" w:eastAsia="Arial" w:hAnsi="Arial"/>
-          <w:b/>
-          <w:bCs/>
-          <w:color w:val="2F7D4A"/>
-          <w:sz w:val="17"/>
-          <w:szCs w:val="17"/>
-        </w:rPr>
-        <w:t xml:space="preserve">   happy</w:t>
-      </w:r>
-      <w:r>
-        <w:rPr>
-          <w:rFonts w:ascii="Arial" w:cs="Arial" w:eastAsia="Arial" w:hAnsi="Arial"/>
-          <w:i/>
-          <w:iCs/>
-          <w:color w:val="2E2433"/>
-          <w:sz w:val="18"/>
-          <w:szCs w:val="18"/>
-        </w:rPr>
-        <w:t xml:space="preserve">   Warm and drowsy, a little wicked.</w:t>
+        <w:t xml:space="preserve">   Flustered.</w:t>
       </w:r>
     </w:p>
     <w:p>
@@ -19430,7 +19322,7 @@
           <w:sz w:val="25"/>
           <w:szCs w:val="25"/>
         </w:rPr>
-        <w:t xml:space="preserve">Two hundred years, and nobody told me it could feel like that. I'd like it noted that I'm saying this very calmly.</w:t>
+        <w:t xml:space="preserve">Two hundred years, and nobody told me a spirit could feel like that. I'd like it noted that I'm saying this very calmly.</w:t>
       </w:r>
     </w:p>
     <w:p>
@@ -19453,6 +19345,60 @@
           <w:rFonts w:ascii="Arial" w:cs="Arial" w:eastAsia="Arial" w:hAnsi="Arial"/>
           <w:b/>
           <w:bCs/>
+          <w:color w:val="2F7D4A"/>
+          <w:sz w:val="17"/>
+          <w:szCs w:val="17"/>
+        </w:rPr>
+        <w:t xml:space="preserve">   happy</w:t>
+      </w:r>
+      <w:r>
+        <w:rPr>
+          <w:rFonts w:ascii="Arial" w:cs="Arial" w:eastAsia="Arial" w:hAnsi="Arial"/>
+          <w:i/>
+          <w:iCs/>
+          <w:color w:val="2E2433"/>
+          <w:sz w:val="18"/>
+          <w:szCs w:val="18"/>
+        </w:rPr>
+        <w:t xml:space="preserve">   Happy.</w:t>
+      </w:r>
+    </w:p>
+    <w:p>
+      <w:pPr>
+        <w:keepNext/>
+        <w:spacing w:after="30" w:before="40"/>
+        <w:ind w:left="360"/>
+      </w:pPr>
+      <w:r>
+        <w:rPr>
+          <w:rFonts w:ascii="Arial" w:cs="Arial" w:eastAsia="Arial" w:hAnsi="Arial"/>
+          <w:color w:val="2E2433"/>
+          <w:sz w:val="25"/>
+          <w:szCs w:val="25"/>
+        </w:rPr>
+        <w:t xml:space="preserve">Don't look at them. They're not for you. They're seasonal.</w:t>
+      </w:r>
+    </w:p>
+    <w:p>
+      <w:pPr>
+        <w:keepLines/>
+        <w:spacing w:after="140"/>
+        <w:ind w:left="360"/>
+      </w:pPr>
+      <w:r>
+        <w:rPr>
+          <w:rFonts w:ascii="Courier New" w:cs="Courier New" w:eastAsia="Courier New" w:hAnsi="Courier New"/>
+          <w:color w:val="7A6B78"/>
+          <w:sz w:val="16"/>
+          <w:szCs w:val="16"/>
+        </w:rPr>
+        <w:t xml:space="preserve">hazel_end_02</w:t>
+      </w:r>
+      <w:r>
+        <w:rPr>
+          <w:rFonts w:ascii="Arial" w:cs="Arial" w:eastAsia="Arial" w:hAnsi="Arial"/>
+          <w:b/>
+          <w:bCs/>
           <w:color w:val="B0457A"/>
           <w:sz w:val="17"/>
           <w:szCs w:val="17"/>
@@ -19468,77 +19414,23 @@
           <w:sz w:val="18"/>
           <w:szCs w:val="18"/>
         </w:rPr>
-        <w:t xml:space="preserve">   Calm voice, completely undone underneath.</w:t>
-      </w:r>
-    </w:p>
-    <w:p>
-      <w:pPr>
-        <w:keepNext/>
-        <w:spacing w:after="30" w:before="40"/>
-        <w:ind w:left="360"/>
-      </w:pPr>
-      <w:r>
-        <w:rPr>
-          <w:rFonts w:ascii="Arial" w:cs="Arial" w:eastAsia="Arial" w:hAnsi="Arial"/>
-          <w:color w:val="2E2433"/>
-          <w:sz w:val="25"/>
-          <w:szCs w:val="25"/>
-        </w:rPr>
-        <w:t xml:space="preserve">Don't look at them. They're not for you. They're seasonal.</w:t>
-      </w:r>
-    </w:p>
-    <w:p>
-      <w:pPr>
-        <w:keepLines/>
-        <w:spacing w:after="140"/>
-        <w:ind w:left="360"/>
-      </w:pPr>
-      <w:r>
-        <w:rPr>
-          <w:rFonts w:ascii="Courier New" w:cs="Courier New" w:eastAsia="Courier New" w:hAnsi="Courier New"/>
-          <w:color w:val="7A6B78"/>
-          <w:sz w:val="16"/>
-          <w:szCs w:val="16"/>
-        </w:rPr>
-        <w:t xml:space="preserve">hazel_end_02</w:t>
-      </w:r>
-      <w:r>
-        <w:rPr>
-          <w:rFonts w:ascii="Arial" w:cs="Arial" w:eastAsia="Arial" w:hAnsi="Arial"/>
-          <w:b/>
-          <w:bCs/>
-          <w:color w:val="B0457A"/>
-          <w:sz w:val="17"/>
-          <w:szCs w:val="17"/>
-        </w:rPr>
-        <w:t xml:space="preserve">   shy</w:t>
-      </w:r>
-      <w:r>
-        <w:rPr>
-          <w:rFonts w:ascii="Arial" w:cs="Arial" w:eastAsia="Arial" w:hAnsi="Arial"/>
-          <w:i/>
-          <w:iCs/>
-          <w:color w:val="2E2433"/>
-          <w:sz w:val="18"/>
-          <w:szCs w:val="18"/>
-        </w:rPr>
-        <w:t xml:space="preserve">   Flustered and a terrible liar, deadpan anyway.</w:t>
-      </w:r>
-    </w:p>
-    <w:p>
-      <w:pPr>
-        <w:keepNext/>
-        <w:spacing w:after="30" w:before="40"/>
-        <w:ind w:left="360"/>
-      </w:pPr>
-      <w:r>
-        <w:rPr>
-          <w:rFonts w:ascii="Arial" w:cs="Arial" w:eastAsia="Arial" w:hAnsi="Arial"/>
-          <w:color w:val="2E2433"/>
-          <w:sz w:val="25"/>
-          <w:szCs w:val="25"/>
-        </w:rPr>
-        <w:t xml:space="preserve">Fine. They're for you. I haven't flowered out of season since before the mill was built. People are going to talk.</w:t>
+        <w:t xml:space="preserve">   Flustered.</w:t>
+      </w:r>
+    </w:p>
+    <w:p>
+      <w:pPr>
+        <w:keepNext/>
+        <w:spacing w:after="30" w:before="40"/>
+        <w:ind w:left="360"/>
+      </w:pPr>
+      <w:r>
+        <w:rPr>
+          <w:rFonts w:ascii="Arial" w:cs="Arial" w:eastAsia="Arial" w:hAnsi="Arial"/>
+          <w:color w:val="2E2433"/>
+          <w:sz w:val="25"/>
+          <w:szCs w:val="25"/>
+        </w:rPr>
+        <w:t xml:space="preserve">Fine. They're for you. I haven't flowered out of season since before the mill was built. The animals are going to talk.</w:t>
       </w:r>
     </w:p>
     <w:p>
@@ -19576,7 +19468,7 @@
           <w:sz w:val="18"/>
           <w:szCs w:val="18"/>
         </w:rPr>
-        <w:t xml:space="preserve">   Giving in; fond and a bit exasperated with herself.</w:t>
+        <w:t xml:space="preserve">   Happy.</w:t>
       </w:r>
     </w:p>
     <w:p>
@@ -19633,38 +19525,38 @@
           <w:rFonts w:ascii="Arial" w:cs="Arial" w:eastAsia="Arial" w:hAnsi="Arial"/>
           <w:b/>
           <w:bCs/>
-          <w:color w:val="2F7D4A"/>
-          <w:sz w:val="17"/>
-          <w:szCs w:val="17"/>
-        </w:rPr>
-        <w:t xml:space="preserve">   happy</w:t>
-      </w:r>
-      <w:r>
-        <w:rPr>
-          <w:rFonts w:ascii="Arial" w:cs="Arial" w:eastAsia="Arial" w:hAnsi="Arial"/>
-          <w:i/>
-          <w:iCs/>
-          <w:color w:val="2E2433"/>
-          <w:sz w:val="18"/>
-          <w:szCs w:val="18"/>
-        </w:rPr>
-        <w:t xml:space="preserve">   Escalating warning, trying not to laugh.</w:t>
-      </w:r>
-    </w:p>
-    <w:p>
-      <w:pPr>
-        <w:keepNext/>
-        <w:spacing w:after="30" w:before="40"/>
-        <w:ind w:left="360"/>
-      </w:pPr>
-      <w:r>
-        <w:rPr>
-          <w:rFonts w:ascii="Arial" w:cs="Arial" w:eastAsia="Arial" w:hAnsi="Arial"/>
-          <w:color w:val="2E2433"/>
-          <w:sz w:val="25"/>
-          <w:szCs w:val="25"/>
-        </w:rPr>
-        <w:t xml:space="preserve">Plant something near me. Something that needs watering every day, so you've got a reason to come by.</w:t>
+          <w:color w:val="6B6B6B"/>
+          <w:sz w:val="17"/>
+          <w:szCs w:val="17"/>
+        </w:rPr>
+        <w:t xml:space="preserve">   neutral</w:t>
+      </w:r>
+      <w:r>
+        <w:rPr>
+          <w:rFonts w:ascii="Arial" w:cs="Arial" w:eastAsia="Arial" w:hAnsi="Arial"/>
+          <w:i/>
+          <w:iCs/>
+          <w:color w:val="2E2433"/>
+          <w:sz w:val="18"/>
+          <w:szCs w:val="18"/>
+        </w:rPr>
+        <w:t xml:space="preserve">   Teasing.</w:t>
+      </w:r>
+    </w:p>
+    <w:p>
+      <w:pPr>
+        <w:keepNext/>
+        <w:spacing w:after="30" w:before="40"/>
+        <w:ind w:left="360"/>
+      </w:pPr>
+      <w:r>
+        <w:rPr>
+          <w:rFonts w:ascii="Arial" w:cs="Arial" w:eastAsia="Arial" w:hAnsi="Arial"/>
+          <w:color w:val="2E2433"/>
+          <w:sz w:val="25"/>
+          <w:szCs w:val="25"/>
+        </w:rPr>
+        <w:t xml:space="preserve">Plant something near me. So there's something of yours here when you're not.</w:t>
       </w:r>
     </w:p>
     <w:p>
@@ -19702,133 +19594,7 @@
           <w:sz w:val="18"/>
           <w:szCs w:val="18"/>
         </w:rPr>
-        <w:t xml:space="preserve">   Simple, a little shy; she's thought about it.</w:t>
-      </w:r>
-    </w:p>
-    <w:p>
-      <w:pPr>
-        <w:keepNext/>
-        <w:spacing w:after="30" w:before="40"/>
-        <w:ind w:left="360"/>
-      </w:pPr>
-      <w:r>
-        <w:rPr>
-          <w:rFonts w:ascii="Arial" w:cs="Arial" w:eastAsia="Arial" w:hAnsi="Arial"/>
-          <w:color w:val="2E2433"/>
-          <w:sz w:val="25"/>
-          <w:szCs w:val="25"/>
-        </w:rPr>
-        <w:t xml:space="preserve">Go on, then. What are you planting? It'll outlast both of us. Well. It'll outlast you.</w:t>
-      </w:r>
-    </w:p>
-    <w:p>
-      <w:pPr>
-        <w:keepLines/>
-        <w:spacing w:after="140"/>
-        <w:ind w:left="360"/>
-      </w:pPr>
-      <w:r>
-        <w:rPr>
-          <w:rFonts w:ascii="Courier New" w:cs="Courier New" w:eastAsia="Courier New" w:hAnsi="Courier New"/>
-          <w:color w:val="7A6B78"/>
-          <w:sz w:val="16"/>
-          <w:szCs w:val="16"/>
-        </w:rPr>
-        <w:t xml:space="preserve">hazel_end_06</w:t>
-      </w:r>
-      <w:r>
-        <w:rPr>
-          <w:rFonts w:ascii="Arial" w:cs="Arial" w:eastAsia="Arial" w:hAnsi="Arial"/>
-          <w:b/>
-          <w:bCs/>
-          <w:color w:val="6B6B6B"/>
-          <w:sz w:val="17"/>
-          <w:szCs w:val="17"/>
-        </w:rPr>
-        <w:t xml:space="preserve">   neutral</w:t>
-      </w:r>
-      <w:r>
-        <w:rPr>
-          <w:rFonts w:ascii="Arial" w:cs="Arial" w:eastAsia="Arial" w:hAnsi="Arial"/>
-          <w:i/>
-          <w:iCs/>
-          <w:color w:val="2E2433"/>
-          <w:sz w:val="18"/>
-          <w:szCs w:val="18"/>
-        </w:rPr>
-        <w:t xml:space="preserve">   Gentle, dry correction at the end.</w:t>
-      </w:r>
-    </w:p>
-    <w:p>
-      <w:pPr>
-        <w:keepNext/>
-        <w:spacing w:after="60" w:before="0"/>
-        <w:ind w:left="360"/>
-      </w:pPr>
-      <w:r>
-        <w:rPr>
-          <w:rFonts w:ascii="Arial" w:cs="Arial" w:eastAsia="Arial" w:hAnsi="Arial"/>
-          <w:i/>
-          <w:iCs/>
-          <w:color w:val="7A6B78"/>
-          <w:sz w:val="19"/>
-          <w:szCs w:val="19"/>
-        </w:rPr>
-        <w:t xml:space="preserve">You say another hazel, so she isn't the only one.</w:t>
-      </w:r>
-    </w:p>
-    <w:p>
-      <w:pPr>
-        <w:keepNext/>
-        <w:spacing w:after="30" w:before="40"/>
-        <w:ind w:left="360"/>
-      </w:pPr>
-      <w:r>
-        <w:rPr>
-          <w:rFonts w:ascii="Arial" w:cs="Arial" w:eastAsia="Arial" w:hAnsi="Arial"/>
-          <w:color w:val="2E2433"/>
-          <w:sz w:val="25"/>
-          <w:szCs w:val="25"/>
-        </w:rPr>
-        <w:t xml:space="preserve">A neighbour. I've never had a neighbour.</w:t>
-      </w:r>
-    </w:p>
-    <w:p>
-      <w:pPr>
-        <w:keepLines/>
-        <w:spacing w:after="140"/>
-        <w:ind w:left="360"/>
-      </w:pPr>
-      <w:r>
-        <w:rPr>
-          <w:rFonts w:ascii="Courier New" w:cs="Courier New" w:eastAsia="Courier New" w:hAnsi="Courier New"/>
-          <w:color w:val="7A6B78"/>
-          <w:sz w:val="16"/>
-          <w:szCs w:val="16"/>
-        </w:rPr>
-        <w:t xml:space="preserve">hazel_end_07</w:t>
-      </w:r>
-      <w:r>
-        <w:rPr>
-          <w:rFonts w:ascii="Arial" w:cs="Arial" w:eastAsia="Arial" w:hAnsi="Arial"/>
-          <w:b/>
-          <w:bCs/>
-          <w:color w:val="B0457A"/>
-          <w:sz w:val="17"/>
-          <w:szCs w:val="17"/>
-        </w:rPr>
-        <w:t xml:space="preserve">   shy</w:t>
-      </w:r>
-      <w:r>
-        <w:rPr>
-          <w:rFonts w:ascii="Arial" w:cs="Arial" w:eastAsia="Arial" w:hAnsi="Arial"/>
-          <w:i/>
-          <w:iCs/>
-          <w:color w:val="2E2433"/>
-          <w:sz w:val="18"/>
-          <w:szCs w:val="18"/>
-        </w:rPr>
-        <w:t xml:space="preserve">   Quiet wonder.</w:t>
+        <w:t xml:space="preserve">   Shy.</w:t>
       </w:r>
     </w:p>
     <w:p>
@@ -19883,7 +19649,7 @@
           <w:sz w:val="25"/>
           <w:szCs w:val="25"/>
         </w:rPr>
-        <w:t xml:space="preserve">A clock that only works when the sun's out. Someone finally made one that keeps sensible hours.</w:t>
+        <w:t xml:space="preserve">A clock that only works when the sun's out.</w:t>
       </w:r>
     </w:p>
     <w:p>
@@ -19906,22 +19672,22 @@
           <w:rFonts w:ascii="Arial" w:cs="Arial" w:eastAsia="Arial" w:hAnsi="Arial"/>
           <w:b/>
           <w:bCs/>
-          <w:color w:val="B7791F"/>
-          <w:sz w:val="17"/>
-          <w:szCs w:val="17"/>
-        </w:rPr>
-        <w:t xml:space="preserve">   surprised</w:t>
-      </w:r>
-      <w:r>
-        <w:rPr>
-          <w:rFonts w:ascii="Arial" w:cs="Arial" w:eastAsia="Arial" w:hAnsi="Arial"/>
-          <w:i/>
-          <w:iCs/>
-          <w:color w:val="2E2433"/>
-          <w:sz w:val="18"/>
-          <w:szCs w:val="18"/>
-        </w:rPr>
-        <w:t xml:space="preserve">   Delighted, dry. A rare open smile in the voice.</w:t>
+          <w:color w:val="2F7D4A"/>
+          <w:sz w:val="17"/>
+          <w:szCs w:val="17"/>
+        </w:rPr>
+        <w:t xml:space="preserve">   happy</w:t>
+      </w:r>
+      <w:r>
+        <w:rPr>
+          <w:rFonts w:ascii="Arial" w:cs="Arial" w:eastAsia="Arial" w:hAnsi="Arial"/>
+          <w:i/>
+          <w:iCs/>
+          <w:color w:val="2E2433"/>
+          <w:sz w:val="18"/>
+          <w:szCs w:val="18"/>
+        </w:rPr>
+        <w:t xml:space="preserve">   Happy.</w:t>
       </w:r>
     </w:p>
     <w:p>
@@ -19955,7 +19721,7 @@
           <w:sz w:val="25"/>
           <w:szCs w:val="25"/>
         </w:rPr>
-        <w:t xml:space="preserve">I'll hang it on the low branch. You can see the path from there, which is where you come from. Not that I watch it.</w:t>
+        <w:t xml:space="preserve">I'll keep it on a low branch where I can see it. No, I won't use it to count time until our next meeting.</w:t>
       </w:r>
     </w:p>
     <w:p>
@@ -19993,7 +19759,7 @@
           <w:sz w:val="18"/>
           <w:szCs w:val="18"/>
         </w:rPr>
-        <w:t xml:space="preserve">   Quiet, shy, saying more than she planned to.</w:t>
+        <w:t xml:space="preserve">   Shy.</w:t>
       </w:r>
     </w:p>
     <w:p>
@@ -20071,22 +19837,22 @@
           <w:rFonts w:ascii="Arial" w:cs="Arial" w:eastAsia="Arial" w:hAnsi="Arial"/>
           <w:b/>
           <w:bCs/>
-          <w:color w:val="6B6B6B"/>
-          <w:sz w:val="17"/>
-          <w:szCs w:val="17"/>
-        </w:rPr>
-        <w:t xml:space="preserve">   neutral</w:t>
-      </w:r>
-      <w:r>
-        <w:rPr>
-          <w:rFonts w:ascii="Arial" w:cs="Arial" w:eastAsia="Arial" w:hAnsi="Arial"/>
-          <w:i/>
-          <w:iCs/>
-          <w:color w:val="2E2433"/>
-          <w:sz w:val="18"/>
-          <w:szCs w:val="18"/>
-        </w:rPr>
-        <w:t xml:space="preserve">   Content.</w:t>
+          <w:color w:val="2F7D4A"/>
+          <w:sz w:val="17"/>
+          <w:szCs w:val="17"/>
+        </w:rPr>
+        <w:t xml:space="preserve">   happy</w:t>
+      </w:r>
+      <w:r>
+        <w:rPr>
+          <w:rFonts w:ascii="Arial" w:cs="Arial" w:eastAsia="Arial" w:hAnsi="Arial"/>
+          <w:i/>
+          <w:iCs/>
+          <w:color w:val="2E2433"/>
+          <w:sz w:val="18"/>
+          <w:szCs w:val="18"/>
+        </w:rPr>
+        <w:t xml:space="preserve">   Happy.</w:t>
       </w:r>
     </w:p>
     <w:p>
@@ -20125,22 +19891,22 @@
           <w:rFonts w:ascii="Arial" w:cs="Arial" w:eastAsia="Arial" w:hAnsi="Arial"/>
           <w:b/>
           <w:bCs/>
-          <w:color w:val="6B6B6B"/>
-          <w:sz w:val="17"/>
-          <w:szCs w:val="17"/>
-        </w:rPr>
-        <w:t xml:space="preserve">   neutral</w:t>
-      </w:r>
-      <w:r>
-        <w:rPr>
-          <w:rFonts w:ascii="Arial" w:cs="Arial" w:eastAsia="Arial" w:hAnsi="Arial"/>
-          <w:i/>
-          <w:iCs/>
-          <w:color w:val="2E2433"/>
-          <w:sz w:val="18"/>
-          <w:szCs w:val="18"/>
-        </w:rPr>
-        <w:t xml:space="preserve">   Dreamy, slow.</w:t>
+          <w:color w:val="2F7D4A"/>
+          <w:sz w:val="17"/>
+          <w:szCs w:val="17"/>
+        </w:rPr>
+        <w:t xml:space="preserve">   happy</w:t>
+      </w:r>
+      <w:r>
+        <w:rPr>
+          <w:rFonts w:ascii="Arial" w:cs="Arial" w:eastAsia="Arial" w:hAnsi="Arial"/>
+          <w:i/>
+          <w:iCs/>
+          <w:color w:val="2E2433"/>
+          <w:sz w:val="18"/>
+          <w:szCs w:val="18"/>
+        </w:rPr>
+        <w:t xml:space="preserve">   Happy.</w:t>
       </w:r>
     </w:p>
     <w:p>
@@ -20179,22 +19945,22 @@
           <w:rFonts w:ascii="Arial" w:cs="Arial" w:eastAsia="Arial" w:hAnsi="Arial"/>
           <w:b/>
           <w:bCs/>
-          <w:color w:val="6B6B6B"/>
-          <w:sz w:val="17"/>
-          <w:szCs w:val="17"/>
-        </w:rPr>
-        <w:t xml:space="preserve">   neutral</w:t>
-      </w:r>
-      <w:r>
-        <w:rPr>
-          <w:rFonts w:ascii="Arial" w:cs="Arial" w:eastAsia="Arial" w:hAnsi="Arial"/>
-          <w:i/>
-          <w:iCs/>
-          <w:color w:val="2E2433"/>
-          <w:sz w:val="18"/>
-          <w:szCs w:val="18"/>
-        </w:rPr>
-        <w:t xml:space="preserve">   Low, approving.</w:t>
+          <w:color w:val="7A3FB0"/>
+          <w:sz w:val="17"/>
+          <w:szCs w:val="17"/>
+        </w:rPr>
+        <w:t xml:space="preserve">   teasing</w:t>
+      </w:r>
+      <w:r>
+        <w:rPr>
+          <w:rFonts w:ascii="Arial" w:cs="Arial" w:eastAsia="Arial" w:hAnsi="Arial"/>
+          <w:i/>
+          <w:iCs/>
+          <w:color w:val="2E2433"/>
+          <w:sz w:val="18"/>
+          <w:szCs w:val="18"/>
+        </w:rPr>
+        <w:t xml:space="preserve">   Flirting.</w:t>
       </w:r>
     </w:p>
     <w:p>
@@ -20233,38 +19999,38 @@
           <w:rFonts w:ascii="Arial" w:cs="Arial" w:eastAsia="Arial" w:hAnsi="Arial"/>
           <w:b/>
           <w:bCs/>
-          <w:color w:val="6B6B6B"/>
-          <w:sz w:val="17"/>
-          <w:szCs w:val="17"/>
-        </w:rPr>
-        <w:t xml:space="preserve">   neutral</w:t>
-      </w:r>
-      <w:r>
-        <w:rPr>
-          <w:rFonts w:ascii="Arial" w:cs="Arial" w:eastAsia="Arial" w:hAnsi="Arial"/>
-          <w:i/>
-          <w:iCs/>
-          <w:color w:val="2E2433"/>
-          <w:sz w:val="18"/>
-          <w:szCs w:val="18"/>
-        </w:rPr>
-        <w:t xml:space="preserve">   Fond, a little suggestive.</w:t>
-      </w:r>
-    </w:p>
-    <w:p>
-      <w:pPr>
-        <w:keepNext/>
-        <w:spacing w:after="30" w:before="40"/>
-        <w:ind w:left="360"/>
-      </w:pPr>
-      <w:r>
-        <w:rPr>
-          <w:rFonts w:ascii="Arial" w:cs="Arial" w:eastAsia="Arial" w:hAnsi="Arial"/>
-          <w:color w:val="2E2433"/>
-          <w:sz w:val="25"/>
-          <w:szCs w:val="25"/>
-        </w:rPr>
-        <w:t xml:space="preserve">Blossom. You have my attention.</w:t>
+          <w:color w:val="7A3FB0"/>
+          <w:sz w:val="17"/>
+          <w:szCs w:val="17"/>
+        </w:rPr>
+        <w:t xml:space="preserve">   teasing</w:t>
+      </w:r>
+      <w:r>
+        <w:rPr>
+          <w:rFonts w:ascii="Arial" w:cs="Arial" w:eastAsia="Arial" w:hAnsi="Arial"/>
+          <w:i/>
+          <w:iCs/>
+          <w:color w:val="2E2433"/>
+          <w:sz w:val="18"/>
+          <w:szCs w:val="18"/>
+        </w:rPr>
+        <w:t xml:space="preserve">   Flirting.</w:t>
+      </w:r>
+    </w:p>
+    <w:p>
+      <w:pPr>
+        <w:keepNext/>
+        <w:spacing w:after="30" w:before="40"/>
+        <w:ind w:left="360"/>
+      </w:pPr>
+      <w:r>
+        <w:rPr>
+          <w:rFonts w:ascii="Arial" w:cs="Arial" w:eastAsia="Arial" w:hAnsi="Arial"/>
+          <w:color w:val="2E2433"/>
+          <w:sz w:val="25"/>
+          <w:szCs w:val="25"/>
+        </w:rPr>
+        <w:t xml:space="preserve">Blossom.</w:t>
       </w:r>
     </w:p>
     <w:p>
@@ -20287,38 +20053,38 @@
           <w:rFonts w:ascii="Arial" w:cs="Arial" w:eastAsia="Arial" w:hAnsi="Arial"/>
           <w:b/>
           <w:bCs/>
-          <w:color w:val="6B6B6B"/>
-          <w:sz w:val="17"/>
-          <w:szCs w:val="17"/>
-        </w:rPr>
-        <w:t xml:space="preserve">   neutral</w:t>
-      </w:r>
-      <w:r>
-        <w:rPr>
-          <w:rFonts w:ascii="Arial" w:cs="Arial" w:eastAsia="Arial" w:hAnsi="Arial"/>
-          <w:i/>
-          <w:iCs/>
-          <w:color w:val="2E2433"/>
-          <w:sz w:val="18"/>
-          <w:szCs w:val="18"/>
-        </w:rPr>
-        <w:t xml:space="preserve">   Dry, pleased.</w:t>
-      </w:r>
-    </w:p>
-    <w:p>
-      <w:pPr>
-        <w:keepNext/>
-        <w:spacing w:after="30" w:before="40"/>
-        <w:ind w:left="360"/>
-      </w:pPr>
-      <w:r>
-        <w:rPr>
-          <w:rFonts w:ascii="Arial" w:cs="Arial" w:eastAsia="Arial" w:hAnsi="Arial"/>
-          <w:color w:val="2E2433"/>
-          <w:sz w:val="25"/>
-          <w:szCs w:val="25"/>
-        </w:rPr>
-        <w:t xml:space="preserve">Don't stop on my account.</w:t>
+          <w:color w:val="2F7D4A"/>
+          <w:sz w:val="17"/>
+          <w:szCs w:val="17"/>
+        </w:rPr>
+        <w:t xml:space="preserve">   happy</w:t>
+      </w:r>
+      <w:r>
+        <w:rPr>
+          <w:rFonts w:ascii="Arial" w:cs="Arial" w:eastAsia="Arial" w:hAnsi="Arial"/>
+          <w:i/>
+          <w:iCs/>
+          <w:color w:val="2E2433"/>
+          <w:sz w:val="18"/>
+          <w:szCs w:val="18"/>
+        </w:rPr>
+        <w:t xml:space="preserve">   Happy.</w:t>
+      </w:r>
+    </w:p>
+    <w:p>
+      <w:pPr>
+        <w:keepNext/>
+        <w:spacing w:after="30" w:before="40"/>
+        <w:ind w:left="360"/>
+      </w:pPr>
+      <w:r>
+        <w:rPr>
+          <w:rFonts w:ascii="Arial" w:cs="Arial" w:eastAsia="Arial" w:hAnsi="Arial"/>
+          <w:color w:val="2E2433"/>
+          <w:sz w:val="25"/>
+          <w:szCs w:val="25"/>
+        </w:rPr>
+        <w:t xml:space="preserve">That's lovely. Keep going.</w:t>
       </w:r>
     </w:p>
     <w:p>
@@ -20341,22 +20107,22 @@
           <w:rFonts w:ascii="Arial" w:cs="Arial" w:eastAsia="Arial" w:hAnsi="Arial"/>
           <w:b/>
           <w:bCs/>
-          <w:color w:val="6B6B6B"/>
-          <w:sz w:val="17"/>
-          <w:szCs w:val="17"/>
-        </w:rPr>
-        <w:t xml:space="preserve">   neutral</w:t>
-      </w:r>
-      <w:r>
-        <w:rPr>
-          <w:rFonts w:ascii="Arial" w:cs="Arial" w:eastAsia="Arial" w:hAnsi="Arial"/>
-          <w:i/>
-          <w:iCs/>
-          <w:color w:val="2E2433"/>
-          <w:sz w:val="18"/>
-          <w:szCs w:val="18"/>
-        </w:rPr>
-        <w:t xml:space="preserve">   Warm.</w:t>
+          <w:color w:val="2F7D4A"/>
+          <w:sz w:val="17"/>
+          <w:szCs w:val="17"/>
+        </w:rPr>
+        <w:t xml:space="preserve">   happy</w:t>
+      </w:r>
+      <w:r>
+        <w:rPr>
+          <w:rFonts w:ascii="Arial" w:cs="Arial" w:eastAsia="Arial" w:hAnsi="Arial"/>
+          <w:i/>
+          <w:iCs/>
+          <w:color w:val="2E2433"/>
+          <w:sz w:val="18"/>
+          <w:szCs w:val="18"/>
+        </w:rPr>
+        <w:t xml:space="preserve">   Happy.</w:t>
       </w:r>
     </w:p>
     <w:p>
@@ -20434,6 +20200,114 @@
           <w:rFonts w:ascii="Arial" w:cs="Arial" w:eastAsia="Arial" w:hAnsi="Arial"/>
           <w:b/>
           <w:bCs/>
+          <w:color w:val="B23A3A"/>
+          <w:sz w:val="17"/>
+          <w:szCs w:val="17"/>
+        </w:rPr>
+        <w:t xml:space="preserve">   angry</w:t>
+      </w:r>
+      <w:r>
+        <w:rPr>
+          <w:rFonts w:ascii="Arial" w:cs="Arial" w:eastAsia="Arial" w:hAnsi="Arial"/>
+          <w:i/>
+          <w:iCs/>
+          <w:color w:val="2E2433"/>
+          <w:sz w:val="18"/>
+          <w:szCs w:val="18"/>
+        </w:rPr>
+        <w:t xml:space="preserve">   Annoyed.</w:t>
+      </w:r>
+    </w:p>
+    <w:p>
+      <w:pPr>
+        <w:keepNext/>
+        <w:spacing w:after="30" w:before="40"/>
+        <w:ind w:left="360"/>
+      </w:pPr>
+      <w:r>
+        <w:rPr>
+          <w:rFonts w:ascii="Arial" w:cs="Arial" w:eastAsia="Arial" w:hAnsi="Arial"/>
+          <w:color w:val="2E2433"/>
+          <w:sz w:val="25"/>
+          <w:szCs w:val="25"/>
+        </w:rPr>
+        <w:t xml:space="preserve">Put that out.</w:t>
+      </w:r>
+    </w:p>
+    <w:p>
+      <w:pPr>
+        <w:keepLines/>
+        <w:spacing w:after="140"/>
+        <w:ind w:left="360"/>
+      </w:pPr>
+      <w:r>
+        <w:rPr>
+          <w:rFonts w:ascii="Courier New" w:cs="Courier New" w:eastAsia="Courier New" w:hAnsi="Courier New"/>
+          <w:color w:val="7A6B78"/>
+          <w:sz w:val="16"/>
+          <w:szCs w:val="16"/>
+        </w:rPr>
+        <w:t xml:space="preserve">hazel_least_02</w:t>
+      </w:r>
+      <w:r>
+        <w:rPr>
+          <w:rFonts w:ascii="Arial" w:cs="Arial" w:eastAsia="Arial" w:hAnsi="Arial"/>
+          <w:b/>
+          <w:bCs/>
+          <w:color w:val="B23A3A"/>
+          <w:sz w:val="17"/>
+          <w:szCs w:val="17"/>
+        </w:rPr>
+        <w:t xml:space="preserve">   angry</w:t>
+      </w:r>
+      <w:r>
+        <w:rPr>
+          <w:rFonts w:ascii="Arial" w:cs="Arial" w:eastAsia="Arial" w:hAnsi="Arial"/>
+          <w:i/>
+          <w:iCs/>
+          <w:color w:val="2E2433"/>
+          <w:sz w:val="18"/>
+          <w:szCs w:val="18"/>
+        </w:rPr>
+        <w:t xml:space="preserve">   Angry.</w:t>
+      </w:r>
+    </w:p>
+    <w:p>
+      <w:pPr>
+        <w:keepNext/>
+        <w:spacing w:after="30" w:before="40"/>
+        <w:ind w:left="360"/>
+      </w:pPr>
+      <w:r>
+        <w:rPr>
+          <w:rFonts w:ascii="Arial" w:cs="Arial" w:eastAsia="Arial" w:hAnsi="Arial"/>
+          <w:color w:val="2E2433"/>
+          <w:sz w:val="25"/>
+          <w:szCs w:val="25"/>
+        </w:rPr>
+        <w:t xml:space="preserve">No. I've seen what those do.</w:t>
+      </w:r>
+    </w:p>
+    <w:p>
+      <w:pPr>
+        <w:keepLines/>
+        <w:spacing w:after="140"/>
+        <w:ind w:left="360"/>
+      </w:pPr>
+      <w:r>
+        <w:rPr>
+          <w:rFonts w:ascii="Courier New" w:cs="Courier New" w:eastAsia="Courier New" w:hAnsi="Courier New"/>
+          <w:color w:val="7A6B78"/>
+          <w:sz w:val="16"/>
+          <w:szCs w:val="16"/>
+        </w:rPr>
+        <w:t xml:space="preserve">hazel_least_03</w:t>
+      </w:r>
+      <w:r>
+        <w:rPr>
+          <w:rFonts w:ascii="Arial" w:cs="Arial" w:eastAsia="Arial" w:hAnsi="Arial"/>
+          <w:b/>
+          <w:bCs/>
           <w:color w:val="6B6B6B"/>
           <w:sz w:val="17"/>
           <w:szCs w:val="17"/>
@@ -20449,39 +20323,93 @@
           <w:sz w:val="18"/>
           <w:szCs w:val="18"/>
         </w:rPr>
-        <w:t xml:space="preserve">   Calm disapproval.</w:t>
-      </w:r>
-    </w:p>
-    <w:p>
-      <w:pPr>
-        <w:keepNext/>
-        <w:spacing w:after="30" w:before="40"/>
-        <w:ind w:left="360"/>
-      </w:pPr>
-      <w:r>
-        <w:rPr>
-          <w:rFonts w:ascii="Arial" w:cs="Arial" w:eastAsia="Arial" w:hAnsi="Arial"/>
-          <w:color w:val="2E2433"/>
-          <w:sz w:val="25"/>
-          <w:szCs w:val="25"/>
-        </w:rPr>
-        <w:t xml:space="preserve">Put that out.</w:t>
-      </w:r>
-    </w:p>
-    <w:p>
-      <w:pPr>
-        <w:keepLines/>
-        <w:spacing w:after="140"/>
-        <w:ind w:left="360"/>
-      </w:pPr>
-      <w:r>
-        <w:rPr>
-          <w:rFonts w:ascii="Courier New" w:cs="Courier New" w:eastAsia="Courier New" w:hAnsi="Courier New"/>
-          <w:color w:val="7A6B78"/>
-          <w:sz w:val="16"/>
-          <w:szCs w:val="16"/>
-        </w:rPr>
-        <w:t xml:space="preserve">hazel_least_02</w:t>
+        <w:t xml:space="preserve">   Serious.</w:t>
+      </w:r>
+    </w:p>
+    <w:p>
+      <w:pPr>
+        <w:keepNext/>
+        <w:spacing w:after="30" w:before="40"/>
+        <w:ind w:left="360"/>
+      </w:pPr>
+      <w:r>
+        <w:rPr>
+          <w:rFonts w:ascii="Arial" w:cs="Arial" w:eastAsia="Arial" w:hAnsi="Arial"/>
+          <w:color w:val="2E2433"/>
+          <w:sz w:val="25"/>
+          <w:szCs w:val="25"/>
+        </w:rPr>
+        <w:t xml:space="preserve">I'll pretend I didn't see that.</w:t>
+      </w:r>
+    </w:p>
+    <w:p>
+      <w:pPr>
+        <w:keepLines/>
+        <w:spacing w:after="140"/>
+        <w:ind w:left="360"/>
+      </w:pPr>
+      <w:r>
+        <w:rPr>
+          <w:rFonts w:ascii="Courier New" w:cs="Courier New" w:eastAsia="Courier New" w:hAnsi="Courier New"/>
+          <w:color w:val="7A6B78"/>
+          <w:sz w:val="16"/>
+          <w:szCs w:val="16"/>
+        </w:rPr>
+        <w:t xml:space="preserve">hazel_least_04</w:t>
+      </w:r>
+      <w:r>
+        <w:rPr>
+          <w:rFonts w:ascii="Arial" w:cs="Arial" w:eastAsia="Arial" w:hAnsi="Arial"/>
+          <w:b/>
+          <w:bCs/>
+          <w:color w:val="B23A3A"/>
+          <w:sz w:val="17"/>
+          <w:szCs w:val="17"/>
+        </w:rPr>
+        <w:t xml:space="preserve">   angry</w:t>
+      </w:r>
+      <w:r>
+        <w:rPr>
+          <w:rFonts w:ascii="Arial" w:cs="Arial" w:eastAsia="Arial" w:hAnsi="Arial"/>
+          <w:i/>
+          <w:iCs/>
+          <w:color w:val="2E2433"/>
+          <w:sz w:val="18"/>
+          <w:szCs w:val="18"/>
+        </w:rPr>
+        <w:t xml:space="preserve">   Annoyed.</w:t>
+      </w:r>
+    </w:p>
+    <w:p>
+      <w:pPr>
+        <w:keepNext/>
+        <w:spacing w:after="30" w:before="40"/>
+        <w:ind w:left="360"/>
+      </w:pPr>
+      <w:r>
+        <w:rPr>
+          <w:rFonts w:ascii="Arial" w:cs="Arial" w:eastAsia="Arial" w:hAnsi="Arial"/>
+          <w:color w:val="2E2433"/>
+          <w:sz w:val="25"/>
+          <w:szCs w:val="25"/>
+        </w:rPr>
+        <w:t xml:space="preserve">Mind my leaves with that.</w:t>
+      </w:r>
+    </w:p>
+    <w:p>
+      <w:pPr>
+        <w:keepLines/>
+        <w:spacing w:after="140"/>
+        <w:ind w:left="360"/>
+      </w:pPr>
+      <w:r>
+        <w:rPr>
+          <w:rFonts w:ascii="Courier New" w:cs="Courier New" w:eastAsia="Courier New" w:hAnsi="Courier New"/>
+          <w:color w:val="7A6B78"/>
+          <w:sz w:val="16"/>
+          <w:szCs w:val="16"/>
+        </w:rPr>
+        <w:t xml:space="preserve">hazel_least_05</w:t>
       </w:r>
       <w:r>
         <w:rPr>
@@ -20503,169 +20431,7 @@
           <w:sz w:val="18"/>
           <w:szCs w:val="18"/>
         </w:rPr>
-        <w:t xml:space="preserve">   Quiet order.</w:t>
-      </w:r>
-    </w:p>
-    <w:p>
-      <w:pPr>
-        <w:keepNext/>
-        <w:spacing w:after="30" w:before="40"/>
-        <w:ind w:left="360"/>
-      </w:pPr>
-      <w:r>
-        <w:rPr>
-          <w:rFonts w:ascii="Arial" w:cs="Arial" w:eastAsia="Arial" w:hAnsi="Arial"/>
-          <w:color w:val="2E2433"/>
-          <w:sz w:val="25"/>
-          <w:szCs w:val="25"/>
-        </w:rPr>
-        <w:t xml:space="preserve">No. I've seen what those do.</w:t>
-      </w:r>
-    </w:p>
-    <w:p>
-      <w:pPr>
-        <w:keepLines/>
-        <w:spacing w:after="140"/>
-        <w:ind w:left="360"/>
-      </w:pPr>
-      <w:r>
-        <w:rPr>
-          <w:rFonts w:ascii="Courier New" w:cs="Courier New" w:eastAsia="Courier New" w:hAnsi="Courier New"/>
-          <w:color w:val="7A6B78"/>
-          <w:sz w:val="16"/>
-          <w:szCs w:val="16"/>
-        </w:rPr>
-        <w:t xml:space="preserve">hazel_least_03</w:t>
-      </w:r>
-      <w:r>
-        <w:rPr>
-          <w:rFonts w:ascii="Arial" w:cs="Arial" w:eastAsia="Arial" w:hAnsi="Arial"/>
-          <w:b/>
-          <w:bCs/>
-          <w:color w:val="6B6B6B"/>
-          <w:sz w:val="17"/>
-          <w:szCs w:val="17"/>
-        </w:rPr>
-        <w:t xml:space="preserve">   neutral</w:t>
-      </w:r>
-      <w:r>
-        <w:rPr>
-          <w:rFonts w:ascii="Arial" w:cs="Arial" w:eastAsia="Arial" w:hAnsi="Arial"/>
-          <w:i/>
-          <w:iCs/>
-          <w:color w:val="2E2433"/>
-          <w:sz w:val="18"/>
-          <w:szCs w:val="18"/>
-        </w:rPr>
-        <w:t xml:space="preserve">   Grim, short.</w:t>
-      </w:r>
-    </w:p>
-    <w:p>
-      <w:pPr>
-        <w:keepNext/>
-        <w:spacing w:after="30" w:before="40"/>
-        <w:ind w:left="360"/>
-      </w:pPr>
-      <w:r>
-        <w:rPr>
-          <w:rFonts w:ascii="Arial" w:cs="Arial" w:eastAsia="Arial" w:hAnsi="Arial"/>
-          <w:color w:val="2E2433"/>
-          <w:sz w:val="25"/>
-          <w:szCs w:val="25"/>
-        </w:rPr>
-        <w:t xml:space="preserve">Embers. I'll pretend I didn't see that.</w:t>
-      </w:r>
-    </w:p>
-    <w:p>
-      <w:pPr>
-        <w:keepLines/>
-        <w:spacing w:after="140"/>
-        <w:ind w:left="360"/>
-      </w:pPr>
-      <w:r>
-        <w:rPr>
-          <w:rFonts w:ascii="Courier New" w:cs="Courier New" w:eastAsia="Courier New" w:hAnsi="Courier New"/>
-          <w:color w:val="7A6B78"/>
-          <w:sz w:val="16"/>
-          <w:szCs w:val="16"/>
-        </w:rPr>
-        <w:t xml:space="preserve">hazel_least_04</w:t>
-      </w:r>
-      <w:r>
-        <w:rPr>
-          <w:rFonts w:ascii="Arial" w:cs="Arial" w:eastAsia="Arial" w:hAnsi="Arial"/>
-          <w:b/>
-          <w:bCs/>
-          <w:color w:val="6B6B6B"/>
-          <w:sz w:val="17"/>
-          <w:szCs w:val="17"/>
-        </w:rPr>
-        <w:t xml:space="preserve">   neutral</w:t>
-      </w:r>
-      <w:r>
-        <w:rPr>
-          <w:rFonts w:ascii="Arial" w:cs="Arial" w:eastAsia="Arial" w:hAnsi="Arial"/>
-          <w:i/>
-          <w:iCs/>
-          <w:color w:val="2E2433"/>
-          <w:sz w:val="18"/>
-          <w:szCs w:val="18"/>
-        </w:rPr>
-        <w:t xml:space="preserve">   Dry.</w:t>
-      </w:r>
-    </w:p>
-    <w:p>
-      <w:pPr>
-        <w:keepNext/>
-        <w:spacing w:after="30" w:before="40"/>
-        <w:ind w:left="360"/>
-      </w:pPr>
-      <w:r>
-        <w:rPr>
-          <w:rFonts w:ascii="Arial" w:cs="Arial" w:eastAsia="Arial" w:hAnsi="Arial"/>
-          <w:color w:val="2E2433"/>
-          <w:sz w:val="25"/>
-          <w:szCs w:val="25"/>
-        </w:rPr>
-        <w:t xml:space="preserve">Mind my leaves with that.</w:t>
-      </w:r>
-    </w:p>
-    <w:p>
-      <w:pPr>
-        <w:keepLines/>
-        <w:spacing w:after="140"/>
-        <w:ind w:left="360"/>
-      </w:pPr>
-      <w:r>
-        <w:rPr>
-          <w:rFonts w:ascii="Courier New" w:cs="Courier New" w:eastAsia="Courier New" w:hAnsi="Courier New"/>
-          <w:color w:val="7A6B78"/>
-          <w:sz w:val="16"/>
-          <w:szCs w:val="16"/>
-        </w:rPr>
-        <w:t xml:space="preserve">hazel_least_05</w:t>
-      </w:r>
-      <w:r>
-        <w:rPr>
-          <w:rFonts w:ascii="Arial" w:cs="Arial" w:eastAsia="Arial" w:hAnsi="Arial"/>
-          <w:b/>
-          <w:bCs/>
-          <w:color w:val="6B6B6B"/>
-          <w:sz w:val="17"/>
-          <w:szCs w:val="17"/>
-        </w:rPr>
-        <w:t xml:space="preserve">   neutral</w:t>
-      </w:r>
-      <w:r>
-        <w:rPr>
-          <w:rFonts w:ascii="Arial" w:cs="Arial" w:eastAsia="Arial" w:hAnsi="Arial"/>
-          <w:i/>
-          <w:iCs/>
-          <w:color w:val="2E2433"/>
-          <w:sz w:val="18"/>
-          <w:szCs w:val="18"/>
-        </w:rPr>
-        <w:t xml:space="preserve">   Calm warning.</w:t>
+        <w:t xml:space="preserve">   Serious.</w:t>
       </w:r>
     </w:p>
     <w:p>
@@ -20758,7 +20524,7 @@
           <w:sz w:val="18"/>
           <w:szCs w:val="18"/>
         </w:rPr>
-        <w:t xml:space="preserve">   Patient, dry.</w:t>
+        <w:t xml:space="preserve">   Teasing.</w:t>
       </w:r>
     </w:p>
     <w:p>
@@ -20812,39 +20578,93 @@
           <w:sz w:val="18"/>
           <w:szCs w:val="18"/>
         </w:rPr>
-        <w:t xml:space="preserve">   Dry reminder.</w:t>
-      </w:r>
-    </w:p>
-    <w:p>
-      <w:pPr>
-        <w:keepNext/>
-        <w:spacing w:after="30" w:before="40"/>
-        <w:ind w:left="360"/>
-      </w:pPr>
-      <w:r>
-        <w:rPr>
-          <w:rFonts w:ascii="Arial" w:cs="Arial" w:eastAsia="Arial" w:hAnsi="Arial"/>
-          <w:color w:val="2E2433"/>
-          <w:sz w:val="25"/>
-          <w:szCs w:val="25"/>
-        </w:rPr>
-        <w:t xml:space="preserve">The ferns are watching. Give them something to talk about.</w:t>
-      </w:r>
-    </w:p>
-    <w:p>
-      <w:pPr>
-        <w:keepLines/>
-        <w:spacing w:after="140"/>
-        <w:ind w:left="360"/>
-      </w:pPr>
-      <w:r>
-        <w:rPr>
-          <w:rFonts w:ascii="Courier New" w:cs="Courier New" w:eastAsia="Courier New" w:hAnsi="Courier New"/>
-          <w:color w:val="7A6B78"/>
-          <w:sz w:val="16"/>
-          <w:szCs w:val="16"/>
-        </w:rPr>
-        <w:t xml:space="preserve">hazel_chat_03</w:t>
+        <w:t xml:space="preserve">   Teasing.</w:t>
+      </w:r>
+    </w:p>
+    <w:p>
+      <w:pPr>
+        <w:keepNext/>
+        <w:spacing w:after="30" w:before="40"/>
+        <w:ind w:left="360"/>
+      </w:pPr>
+      <w:r>
+        <w:rPr>
+          <w:rFonts w:ascii="Arial" w:cs="Arial" w:eastAsia="Arial" w:hAnsi="Arial"/>
+          <w:color w:val="2E2433"/>
+          <w:sz w:val="25"/>
+          <w:szCs w:val="25"/>
+        </w:rPr>
+        <w:t xml:space="preserve">You've got mud on your face. Leave it. It suits you.</w:t>
+      </w:r>
+    </w:p>
+    <w:p>
+      <w:pPr>
+        <w:keepLines/>
+        <w:spacing w:after="140"/>
+        <w:ind w:left="360"/>
+      </w:pPr>
+      <w:r>
+        <w:rPr>
+          <w:rFonts w:ascii="Courier New" w:cs="Courier New" w:eastAsia="Courier New" w:hAnsi="Courier New"/>
+          <w:color w:val="7A6B78"/>
+          <w:sz w:val="16"/>
+          <w:szCs w:val="16"/>
+        </w:rPr>
+        <w:t xml:space="preserve">hazel_chat_04</w:t>
+      </w:r>
+      <w:r>
+        <w:rPr>
+          <w:rFonts w:ascii="Arial" w:cs="Arial" w:eastAsia="Arial" w:hAnsi="Arial"/>
+          <w:b/>
+          <w:bCs/>
+          <w:color w:val="7A3FB0"/>
+          <w:sz w:val="17"/>
+          <w:szCs w:val="17"/>
+        </w:rPr>
+        <w:t xml:space="preserve">   teasing</w:t>
+      </w:r>
+      <w:r>
+        <w:rPr>
+          <w:rFonts w:ascii="Arial" w:cs="Arial" w:eastAsia="Arial" w:hAnsi="Arial"/>
+          <w:i/>
+          <w:iCs/>
+          <w:color w:val="2E2433"/>
+          <w:sz w:val="18"/>
+          <w:szCs w:val="18"/>
+        </w:rPr>
+        <w:t xml:space="preserve">   Flirting.</w:t>
+      </w:r>
+    </w:p>
+    <w:p>
+      <w:pPr>
+        <w:keepNext/>
+        <w:spacing w:after="30" w:before="40"/>
+        <w:ind w:left="360"/>
+      </w:pPr>
+      <w:r>
+        <w:rPr>
+          <w:rFonts w:ascii="Arial" w:cs="Arial" w:eastAsia="Arial" w:hAnsi="Arial"/>
+          <w:color w:val="2E2433"/>
+          <w:sz w:val="25"/>
+          <w:szCs w:val="25"/>
+        </w:rPr>
+        <w:t xml:space="preserve">Better than the last one the miller sent.</w:t>
+      </w:r>
+    </w:p>
+    <w:p>
+      <w:pPr>
+        <w:keepLines/>
+        <w:spacing w:after="140"/>
+        <w:ind w:left="360"/>
+      </w:pPr>
+      <w:r>
+        <w:rPr>
+          <w:rFonts w:ascii="Courier New" w:cs="Courier New" w:eastAsia="Courier New" w:hAnsi="Courier New"/>
+          <w:color w:val="7A6B78"/>
+          <w:sz w:val="16"/>
+          <w:szCs w:val="16"/>
+        </w:rPr>
+        <w:t xml:space="preserve">hazel_chat_05</w:t>
       </w:r>
       <w:r>
         <w:rPr>
@@ -20866,39 +20686,39 @@
           <w:sz w:val="18"/>
           <w:szCs w:val="18"/>
         </w:rPr>
-        <w:t xml:space="preserve">   Sly.</w:t>
-      </w:r>
-    </w:p>
-    <w:p>
-      <w:pPr>
-        <w:keepNext/>
-        <w:spacing w:after="30" w:before="40"/>
-        <w:ind w:left="360"/>
-      </w:pPr>
-      <w:r>
-        <w:rPr>
-          <w:rFonts w:ascii="Arial" w:cs="Arial" w:eastAsia="Arial" w:hAnsi="Arial"/>
-          <w:color w:val="2E2433"/>
-          <w:sz w:val="25"/>
-          <w:szCs w:val="25"/>
-        </w:rPr>
-        <w:t xml:space="preserve">You've got mud on your face. Leave it. It suits you.</w:t>
-      </w:r>
-    </w:p>
-    <w:p>
-      <w:pPr>
-        <w:keepLines/>
-        <w:spacing w:after="140"/>
-        <w:ind w:left="360"/>
-      </w:pPr>
-      <w:r>
-        <w:rPr>
-          <w:rFonts w:ascii="Courier New" w:cs="Courier New" w:eastAsia="Courier New" w:hAnsi="Courier New"/>
-          <w:color w:val="7A6B78"/>
-          <w:sz w:val="16"/>
-          <w:szCs w:val="16"/>
-        </w:rPr>
-        <w:t xml:space="preserve">hazel_chat_04</w:t>
+        <w:t xml:space="preserve">   Teasing.</w:t>
+      </w:r>
+    </w:p>
+    <w:p>
+      <w:pPr>
+        <w:keepNext/>
+        <w:spacing w:after="30" w:before="40"/>
+        <w:ind w:left="360"/>
+      </w:pPr>
+      <w:r>
+        <w:rPr>
+          <w:rFonts w:ascii="Arial" w:cs="Arial" w:eastAsia="Arial" w:hAnsi="Arial"/>
+          <w:color w:val="2E2433"/>
+          <w:sz w:val="25"/>
+          <w:szCs w:val="25"/>
+        </w:rPr>
+        <w:t xml:space="preserve">I'm not watching you. I'm photosynthesising.</w:t>
+      </w:r>
+    </w:p>
+    <w:p>
+      <w:pPr>
+        <w:keepLines/>
+        <w:spacing w:after="140"/>
+        <w:ind w:left="360"/>
+      </w:pPr>
+      <w:r>
+        <w:rPr>
+          <w:rFonts w:ascii="Courier New" w:cs="Courier New" w:eastAsia="Courier New" w:hAnsi="Courier New"/>
+          <w:color w:val="7A6B78"/>
+          <w:sz w:val="16"/>
+          <w:szCs w:val="16"/>
+        </w:rPr>
+        <w:t xml:space="preserve">hazel_chat_06</w:t>
       </w:r>
       <w:r>
         <w:rPr>
@@ -20920,39 +20740,39 @@
           <w:sz w:val="18"/>
           <w:szCs w:val="18"/>
         </w:rPr>
-        <w:t xml:space="preserve">   Fond.</w:t>
-      </w:r>
-    </w:p>
-    <w:p>
-      <w:pPr>
-        <w:keepNext/>
-        <w:spacing w:after="30" w:before="40"/>
-        <w:ind w:left="360"/>
-      </w:pPr>
-      <w:r>
-        <w:rPr>
-          <w:rFonts w:ascii="Arial" w:cs="Arial" w:eastAsia="Arial" w:hAnsi="Arial"/>
-          <w:color w:val="2E2433"/>
-          <w:sz w:val="25"/>
-          <w:szCs w:val="25"/>
-        </w:rPr>
-        <w:t xml:space="preserve">Better than the last one Aldous sent. Prettier, too.</w:t>
-      </w:r>
-    </w:p>
-    <w:p>
-      <w:pPr>
-        <w:keepLines/>
-        <w:spacing w:after="140"/>
-        <w:ind w:left="360"/>
-      </w:pPr>
-      <w:r>
-        <w:rPr>
-          <w:rFonts w:ascii="Courier New" w:cs="Courier New" w:eastAsia="Courier New" w:hAnsi="Courier New"/>
-          <w:color w:val="7A6B78"/>
-          <w:sz w:val="16"/>
-          <w:szCs w:val="16"/>
-        </w:rPr>
-        <w:t xml:space="preserve">hazel_chat_05</w:t>
+        <w:t xml:space="preserve">   Teasing.</w:t>
+      </w:r>
+    </w:p>
+    <w:p>
+      <w:pPr>
+        <w:keepNext/>
+        <w:spacing w:after="30" w:before="40"/>
+        <w:ind w:left="360"/>
+      </w:pPr>
+      <w:r>
+        <w:rPr>
+          <w:rFonts w:ascii="Arial" w:cs="Arial" w:eastAsia="Arial" w:hAnsi="Arial"/>
+          <w:color w:val="2E2433"/>
+          <w:sz w:val="25"/>
+          <w:szCs w:val="25"/>
+        </w:rPr>
+        <w:t xml:space="preserve">Take your time. I've got about three hundred years.</w:t>
+      </w:r>
+    </w:p>
+    <w:p>
+      <w:pPr>
+        <w:keepLines/>
+        <w:spacing w:after="140"/>
+        <w:ind w:left="360"/>
+      </w:pPr>
+      <w:r>
+        <w:rPr>
+          <w:rFonts w:ascii="Courier New" w:cs="Courier New" w:eastAsia="Courier New" w:hAnsi="Courier New"/>
+          <w:color w:val="7A6B78"/>
+          <w:sz w:val="16"/>
+          <w:szCs w:val="16"/>
+        </w:rPr>
+        <w:t xml:space="preserve">hazel_chat_07</w:t>
       </w:r>
       <w:r>
         <w:rPr>
@@ -20974,223 +20794,7 @@
           <w:sz w:val="18"/>
           <w:szCs w:val="18"/>
         </w:rPr>
-        <w:t xml:space="preserve">   Dry, fond.</w:t>
-      </w:r>
-    </w:p>
-    <w:p>
-      <w:pPr>
-        <w:keepNext/>
-        <w:spacing w:after="30" w:before="40"/>
-        <w:ind w:left="360"/>
-      </w:pPr>
-      <w:r>
-        <w:rPr>
-          <w:rFonts w:ascii="Arial" w:cs="Arial" w:eastAsia="Arial" w:hAnsi="Arial"/>
-          <w:color w:val="2E2433"/>
-          <w:sz w:val="25"/>
-          <w:szCs w:val="25"/>
-        </w:rPr>
-        <w:t xml:space="preserve">I'm not watching you. I'm photosynthesising.</w:t>
-      </w:r>
-    </w:p>
-    <w:p>
-      <w:pPr>
-        <w:keepLines/>
-        <w:spacing w:after="140"/>
-        <w:ind w:left="360"/>
-      </w:pPr>
-      <w:r>
-        <w:rPr>
-          <w:rFonts w:ascii="Courier New" w:cs="Courier New" w:eastAsia="Courier New" w:hAnsi="Courier New"/>
-          <w:color w:val="7A6B78"/>
-          <w:sz w:val="16"/>
-          <w:szCs w:val="16"/>
-        </w:rPr>
-        <w:t xml:space="preserve">hazel_chat_06</w:t>
-      </w:r>
-      <w:r>
-        <w:rPr>
-          <w:rFonts w:ascii="Arial" w:cs="Arial" w:eastAsia="Arial" w:hAnsi="Arial"/>
-          <w:b/>
-          <w:bCs/>
-          <w:color w:val="6B6B6B"/>
-          <w:sz w:val="17"/>
-          <w:szCs w:val="17"/>
-        </w:rPr>
-        <w:t xml:space="preserve">   neutral</w:t>
-      </w:r>
-      <w:r>
-        <w:rPr>
-          <w:rFonts w:ascii="Arial" w:cs="Arial" w:eastAsia="Arial" w:hAnsi="Arial"/>
-          <w:i/>
-          <w:iCs/>
-          <w:color w:val="2E2433"/>
-          <w:sz w:val="18"/>
-          <w:szCs w:val="18"/>
-        </w:rPr>
-        <w:t xml:space="preserve">   Deadpan lie.</w:t>
-      </w:r>
-    </w:p>
-    <w:p>
-      <w:pPr>
-        <w:keepNext/>
-        <w:spacing w:after="30" w:before="40"/>
-        <w:ind w:left="360"/>
-      </w:pPr>
-      <w:r>
-        <w:rPr>
-          <w:rFonts w:ascii="Arial" w:cs="Arial" w:eastAsia="Arial" w:hAnsi="Arial"/>
-          <w:color w:val="2E2433"/>
-          <w:sz w:val="25"/>
-          <w:szCs w:val="25"/>
-        </w:rPr>
-        <w:t xml:space="preserve">Take your time. I've got a few hundred years.</w:t>
-      </w:r>
-    </w:p>
-    <w:p>
-      <w:pPr>
-        <w:keepLines/>
-        <w:spacing w:after="140"/>
-        <w:ind w:left="360"/>
-      </w:pPr>
-      <w:r>
-        <w:rPr>
-          <w:rFonts w:ascii="Courier New" w:cs="Courier New" w:eastAsia="Courier New" w:hAnsi="Courier New"/>
-          <w:color w:val="7A6B78"/>
-          <w:sz w:val="16"/>
-          <w:szCs w:val="16"/>
-        </w:rPr>
-        <w:t xml:space="preserve">hazel_chat_07</w:t>
-      </w:r>
-      <w:r>
-        <w:rPr>
-          <w:rFonts w:ascii="Arial" w:cs="Arial" w:eastAsia="Arial" w:hAnsi="Arial"/>
-          <w:b/>
-          <w:bCs/>
-          <w:color w:val="6B6B6B"/>
-          <w:sz w:val="17"/>
-          <w:szCs w:val="17"/>
-        </w:rPr>
-        <w:t xml:space="preserve">   neutral</w:t>
-      </w:r>
-      <w:r>
-        <w:rPr>
-          <w:rFonts w:ascii="Arial" w:cs="Arial" w:eastAsia="Arial" w:hAnsi="Arial"/>
-          <w:i/>
-          <w:iCs/>
-          <w:color w:val="2E2433"/>
-          <w:sz w:val="18"/>
-          <w:szCs w:val="18"/>
-        </w:rPr>
-        <w:t xml:space="preserve">   Unhurried.</w:t>
-      </w:r>
-    </w:p>
-    <w:p>
-      <w:pPr>
-        <w:keepNext/>
-        <w:spacing w:after="30" w:before="40"/>
-        <w:ind w:left="360"/>
-      </w:pPr>
-      <w:r>
-        <w:rPr>
-          <w:rFonts w:ascii="Arial" w:cs="Arial" w:eastAsia="Arial" w:hAnsi="Arial"/>
-          <w:color w:val="2E2433"/>
-          <w:sz w:val="25"/>
-          <w:szCs w:val="25"/>
-        </w:rPr>
-        <w:t xml:space="preserve">If you see the miller, wave. It makes him nervous.</w:t>
-      </w:r>
-    </w:p>
-    <w:p>
-      <w:pPr>
-        <w:keepLines/>
-        <w:spacing w:after="140"/>
-        <w:ind w:left="360"/>
-      </w:pPr>
-      <w:r>
-        <w:rPr>
-          <w:rFonts w:ascii="Courier New" w:cs="Courier New" w:eastAsia="Courier New" w:hAnsi="Courier New"/>
-          <w:color w:val="7A6B78"/>
-          <w:sz w:val="16"/>
-          <w:szCs w:val="16"/>
-        </w:rPr>
-        <w:t xml:space="preserve">hazel_chat_08</w:t>
-      </w:r>
-      <w:r>
-        <w:rPr>
-          <w:rFonts w:ascii="Arial" w:cs="Arial" w:eastAsia="Arial" w:hAnsi="Arial"/>
-          <w:b/>
-          <w:bCs/>
-          <w:color w:val="6B6B6B"/>
-          <w:sz w:val="17"/>
-          <w:szCs w:val="17"/>
-        </w:rPr>
-        <w:t xml:space="preserve">   neutral</w:t>
-      </w:r>
-      <w:r>
-        <w:rPr>
-          <w:rFonts w:ascii="Arial" w:cs="Arial" w:eastAsia="Arial" w:hAnsi="Arial"/>
-          <w:i/>
-          <w:iCs/>
-          <w:color w:val="2E2433"/>
-          <w:sz w:val="18"/>
-          <w:szCs w:val="18"/>
-        </w:rPr>
-        <w:t xml:space="preserve">   Mischievous.</w:t>
-      </w:r>
-    </w:p>
-    <w:p>
-      <w:pPr>
-        <w:keepNext/>
-        <w:spacing w:after="30" w:before="40"/>
-        <w:ind w:left="360"/>
-      </w:pPr>
-      <w:r>
-        <w:rPr>
-          <w:rFonts w:ascii="Arial" w:cs="Arial" w:eastAsia="Arial" w:hAnsi="Arial"/>
-          <w:color w:val="2E2433"/>
-          <w:sz w:val="25"/>
-          <w:szCs w:val="25"/>
-        </w:rPr>
-        <w:t xml:space="preserve">The badgers think you're doing well. They're wrong, but it's sweet.</w:t>
-      </w:r>
-    </w:p>
-    <w:p>
-      <w:pPr>
-        <w:keepLines/>
-        <w:spacing w:after="140"/>
-        <w:ind w:left="360"/>
-      </w:pPr>
-      <w:r>
-        <w:rPr>
-          <w:rFonts w:ascii="Courier New" w:cs="Courier New" w:eastAsia="Courier New" w:hAnsi="Courier New"/>
-          <w:color w:val="7A6B78"/>
-          <w:sz w:val="16"/>
-          <w:szCs w:val="16"/>
-        </w:rPr>
-        <w:t xml:space="preserve">hazel_chat_09</w:t>
-      </w:r>
-      <w:r>
-        <w:rPr>
-          <w:rFonts w:ascii="Arial" w:cs="Arial" w:eastAsia="Arial" w:hAnsi="Arial"/>
-          <w:b/>
-          <w:bCs/>
-          <w:color w:val="6B6B6B"/>
-          <w:sz w:val="17"/>
-          <w:szCs w:val="17"/>
-        </w:rPr>
-        <w:t xml:space="preserve">   neutral</w:t>
-      </w:r>
-      <w:r>
-        <w:rPr>
-          <w:rFonts w:ascii="Arial" w:cs="Arial" w:eastAsia="Arial" w:hAnsi="Arial"/>
-          <w:i/>
-          <w:iCs/>
-          <w:color w:val="2E2433"/>
-          <w:sz w:val="18"/>
-          <w:szCs w:val="18"/>
-        </w:rPr>
-        <w:t xml:space="preserve">   Teasing.</w:t>
+        <w:t xml:space="preserve">   Calm.</w:t>
       </w:r>
     </w:p>
     <w:sectPr>

</xml_diff>